<commit_message>
docs: atualiza documentacao tecnica e escopo do MVP
</commit_message>
<xml_diff>
--- a/Conecta_Campus_Documentacao/Conecta_Campus_Documentacao_Tecnica.docx
+++ b/Conecta_Campus_Documentacao/Conecta_Campus_Documentacao_Tecnica.docx
@@ -9,7 +9,7 @@
       <w:r>
         <w:rPr>
           <w:b/>
-          <w:color w:val="06152E"/>
+          <w:color w:val="081F3B"/>
           <w:sz w:val="52"/>
         </w:rPr>
         <w:t>CONECTA CAMPUS</w:t>
@@ -21,10 +21,10 @@
       </w:pPr>
       <w:r>
         <w:rPr>
-          <w:b/>
-          <w:sz w:val="28"/>
+          <w:color w:val="505E6E"/>
+          <w:sz w:val="24"/>
         </w:rPr>
-        <w:t>Documentação Técnica, Manual de Uso e README GitHub</w:t>
+        <w:t>Documentação técnica, manual de uso e README GitHub</w:t>
       </w:r>
     </w:p>
     <w:p>
@@ -33,29 +33,23 @@
       </w:pPr>
       <w:r>
         <w:rPr>
-          <w:i/>
+          <w:color w:val="505E6E"/>
+          <w:sz w:val="24"/>
         </w:rPr>
         <w:t>Plataforma de Digital Signage para comunicação institucional universitária</w:t>
-      </w:r>
-    </w:p>
-    <w:p>
-      <w:pPr>
-        <w:jc w:val="center"/>
-      </w:pPr>
-      <w:r>
-        <w:t>Versão documental: 2026</w:t>
       </w:r>
     </w:p>
     <w:p/>
     <w:tbl>
       <w:tblPr>
+        <w:tblStyle w:val="Tabelacomgrade"/>
         <w:tblW w:w="0" w:type="auto"/>
         <w:jc w:val="center"/>
         <w:tblLook w:val="04A0" w:firstRow="1" w:lastRow="0" w:firstColumn="1" w:lastColumn="0" w:noHBand="0" w:noVBand="1"/>
       </w:tblPr>
       <w:tblGrid>
-        <w:gridCol w:w="4896"/>
-        <w:gridCol w:w="4896"/>
+        <w:gridCol w:w="5040"/>
+        <w:gridCol w:w="5040"/>
       </w:tblGrid>
       <w:tr>
         <w:trPr>
@@ -63,28 +57,23 @@
         </w:trPr>
         <w:tc>
           <w:tcPr>
-            <w:tcW w:w="4896" w:type="dxa"/>
+            <w:tcW w:w="5040" w:type="dxa"/>
             <w:shd w:val="clear" w:color="auto" w:fill="D9EAF7"/>
+            <w:vAlign w:val="center"/>
           </w:tcPr>
           <w:p>
             <w:r>
-              <w:rPr>
-                <w:b/>
-                <w:sz w:val="18"/>
-              </w:rPr>
               <w:t>Projeto</w:t>
             </w:r>
           </w:p>
         </w:tc>
         <w:tc>
           <w:tcPr>
-            <w:tcW w:w="4896" w:type="dxa"/>
+            <w:tcW w:w="5040" w:type="dxa"/>
+            <w:vAlign w:val="center"/>
           </w:tcPr>
           <w:p>
             <w:r>
-              <w:rPr>
-                <w:sz w:val="18"/>
-              </w:rPr>
               <w:t>Conecta Campus</w:t>
             </w:r>
           </w:p>
@@ -96,29 +85,24 @@
         </w:trPr>
         <w:tc>
           <w:tcPr>
-            <w:tcW w:w="4896" w:type="dxa"/>
+            <w:tcW w:w="5040" w:type="dxa"/>
             <w:shd w:val="clear" w:color="auto" w:fill="D9EAF7"/>
+            <w:vAlign w:val="center"/>
           </w:tcPr>
           <w:p>
             <w:r>
-              <w:rPr>
-                <w:b/>
-                <w:sz w:val="18"/>
-              </w:rPr>
-              <w:t>Campi de referência</w:t>
+              <w:t>Versão documental</w:t>
             </w:r>
           </w:p>
         </w:tc>
         <w:tc>
           <w:tcPr>
-            <w:tcW w:w="4896" w:type="dxa"/>
+            <w:tcW w:w="5040" w:type="dxa"/>
+            <w:vAlign w:val="center"/>
           </w:tcPr>
           <w:p>
             <w:r>
-              <w:rPr>
-                <w:sz w:val="18"/>
-              </w:rPr>
-              <w:t>Campus Dra. Josefina Demes / Campus Prof. Antonio Giovanni Alves de Sousa</w:t>
+              <w:t>2026 - MVP atual</w:t>
             </w:r>
           </w:p>
         </w:tc>
@@ -129,62 +113,24 @@
         </w:trPr>
         <w:tc>
           <w:tcPr>
-            <w:tcW w:w="4896" w:type="dxa"/>
+            <w:tcW w:w="5040" w:type="dxa"/>
             <w:shd w:val="clear" w:color="auto" w:fill="D9EAF7"/>
+            <w:vAlign w:val="center"/>
           </w:tcPr>
           <w:p>
             <w:r>
-              <w:rPr>
-                <w:b/>
-                <w:sz w:val="18"/>
-              </w:rPr>
-              <w:t>Equipe</w:t>
+              <w:t>Escopo</w:t>
             </w:r>
           </w:p>
         </w:tc>
         <w:tc>
           <w:tcPr>
-            <w:tcW w:w="4896" w:type="dxa"/>
+            <w:tcW w:w="5040" w:type="dxa"/>
+            <w:vAlign w:val="center"/>
           </w:tcPr>
           <w:p>
             <w:r>
-              <w:rPr>
-                <w:sz w:val="18"/>
-              </w:rPr>
-              <w:t>Guilherme Henrique dos Santos Valente; Yuri Duarte Oliveira dos Santos; Luis Felype de Souza Macedo; Alan Cunha Café</w:t>
-            </w:r>
-          </w:p>
-        </w:tc>
-      </w:tr>
-      <w:tr>
-        <w:trPr>
-          <w:jc w:val="center"/>
-        </w:trPr>
-        <w:tc>
-          <w:tcPr>
-            <w:tcW w:w="4896" w:type="dxa"/>
-            <w:shd w:val="clear" w:color="auto" w:fill="D9EAF7"/>
-          </w:tcPr>
-          <w:p>
-            <w:r>
-              <w:rPr>
-                <w:b/>
-                <w:sz w:val="18"/>
-              </w:rPr>
-              <w:t>Orientador</w:t>
-            </w:r>
-          </w:p>
-        </w:tc>
-        <w:tc>
-          <w:tcPr>
-            <w:tcW w:w="4896" w:type="dxa"/>
-          </w:tcPr>
-          <w:p>
-            <w:r>
-              <w:rPr>
-                <w:sz w:val="18"/>
-              </w:rPr>
-              <w:t>José Vigno Moura Sousa</w:t>
+              <w:t>Servidor Flask, player Android/WebView e uso em rede local</w:t>
             </w:r>
           </w:p>
         </w:tc>
@@ -205,19 +151,13 @@
       </w:r>
     </w:p>
     <w:p>
-      <w:pPr>
-        <w:jc w:val="both"/>
-      </w:pPr>
       <w:r>
-        <w:t>O Conecta Campus é uma plataforma de sinalização digital institucional voltada para exibir avisos, editais, eventos, comunicados e conteúdos multimídia em telas instaladas em ambientes universitários. A proposta utiliza um servidor web centralizado e dispositivos clientes leves, como TV Boxes Android e computadores reaproveitados, conectados a televisores ou monitores já existentes.</w:t>
+        <w:t>O Conecta Campus é uma plataforma de sinalização digital institucional voltada para exibir avisos, editais, eventos, comunicados e conteúdos multimídia em telas instaladas em ambientes universitários. A proposta central é centralizar a publicação de informações acadêmicas em um painel web e distribuir esses conteúdos para players conectados a televisores, monitores, TV Boxes Android ou computadores reaproveitados.</w:t>
       </w:r>
     </w:p>
     <w:p>
-      <w:pPr>
-        <w:jc w:val="both"/>
-      </w:pPr>
       <w:r>
-        <w:t>A solução foi pensada para reduzir a dependência de murais físicos, grupos informais e redes sociais descentralizadas, oferecendo um canal visual permanente para a comunidade acadêmica. O sistema também reforça a sustentabilidade tecnológica ao reaproveitar equipamentos que poderiam ser descartados ou permanecer ociosos.</w:t>
+        <w:t>A solução reduz a dependência de murais físicos e canais informais, oferecendo uma comunicação visual mais organizada, rápida e acessível para a comunidade acadêmica.</w:t>
       </w:r>
     </w:p>
     <w:p>
@@ -231,7 +171,6 @@
     <w:p>
       <w:pPr>
         <w:pStyle w:val="Commarcadores"/>
-        <w:jc w:val="both"/>
       </w:pPr>
       <w:r>
         <w:t>Explicar a arquitetura atual do sistema Conecta Campus.</w:t>
@@ -240,7 +179,6 @@
     <w:p>
       <w:pPr>
         <w:pStyle w:val="Commarcadores"/>
-        <w:jc w:val="both"/>
       </w:pPr>
       <w:r>
         <w:t>Descrever o funcionamento do servidor Flask e do Player Android.</w:t>
@@ -249,7 +187,6 @@
     <w:p>
       <w:pPr>
         <w:pStyle w:val="Commarcadores"/>
-        <w:jc w:val="both"/>
       </w:pPr>
       <w:r>
         <w:t>Orientar a instalação em Windows e Linux, sem dependência de WSL.</w:t>
@@ -258,7 +195,6 @@
     <w:p>
       <w:pPr>
         <w:pStyle w:val="Commarcadores"/>
-        <w:jc w:val="both"/>
       </w:pPr>
       <w:r>
         <w:t>Apresentar o uso normal do painel administrativo e do player.</w:t>
@@ -267,16 +203,14 @@
     <w:p>
       <w:pPr>
         <w:pStyle w:val="Commarcadores"/>
-        <w:jc w:val="both"/>
       </w:pPr>
       <w:r>
-        <w:t>Documentar as funcionalidades do MVP atual e os próximos MVPs planejados.</w:t>
+        <w:t>Separar claramente as funcionalidades do MVP atual das evoluções futuras.</w:t>
       </w:r>
     </w:p>
     <w:p>
       <w:pPr>
         <w:pStyle w:val="Commarcadores"/>
-        <w:jc w:val="both"/>
       </w:pPr>
       <w:r>
         <w:t>Fornecer um README em estilo GitHub para publicação do projeto.</w:t>
@@ -291,24 +225,21 @@
       </w:r>
     </w:p>
     <w:p>
-      <w:pPr>
-        <w:jc w:val="both"/>
-      </w:pPr>
       <w:r>
-        <w:t>A arquitetura atual segue o modelo cliente-servidor. O servidor Flask concentra o painel administrativo, banco SQLite, armazenamento das mídias, rotas web e API JSON consumida pelos players. O player Android utiliza WebView para carregar a página de exibição do servidor, mantendo a tela em modo paisagem, modo imersivo e atualização automática.</w:t>
+        <w:t>A arquitetura atual segue o modelo cliente-servidor. O servidor Flask concentra o painel administrativo, banco SQLite, armazenamento de mídias, rotas web e API JSON consumida pelo player. O aplicativo Android utiliza WebView para exibir o player web e atualizar os conteúdos publicados.</w:t>
       </w:r>
     </w:p>
     <w:tbl>
       <w:tblPr>
+        <w:tblStyle w:val="Tabelacomgrade"/>
         <w:tblW w:w="0" w:type="auto"/>
         <w:jc w:val="center"/>
         <w:tblLook w:val="04A0" w:firstRow="1" w:lastRow="0" w:firstColumn="1" w:lastColumn="0" w:noHBand="0" w:noVBand="1"/>
       </w:tblPr>
       <w:tblGrid>
-        <w:gridCol w:w="2448"/>
-        <w:gridCol w:w="2448"/>
-        <w:gridCol w:w="2448"/>
-        <w:gridCol w:w="2448"/>
+        <w:gridCol w:w="3360"/>
+        <w:gridCol w:w="3360"/>
+        <w:gridCol w:w="3360"/>
       </w:tblGrid>
       <w:tr>
         <w:trPr>
@@ -316,61 +247,34 @@
         </w:trPr>
         <w:tc>
           <w:tcPr>
-            <w:tcW w:w="2448" w:type="dxa"/>
-            <w:shd w:val="clear" w:color="auto" w:fill="B7D7EE"/>
+            <w:tcW w:w="3360" w:type="dxa"/>
+            <w:shd w:val="clear" w:color="auto" w:fill="BBD7EE"/>
           </w:tcPr>
           <w:p>
             <w:r>
-              <w:rPr>
-                <w:b/>
-                <w:sz w:val="18"/>
-              </w:rPr>
               <w:t>Camada</w:t>
             </w:r>
           </w:p>
         </w:tc>
         <w:tc>
           <w:tcPr>
-            <w:tcW w:w="2448" w:type="dxa"/>
-            <w:shd w:val="clear" w:color="auto" w:fill="B7D7EE"/>
+            <w:tcW w:w="3360" w:type="dxa"/>
+            <w:shd w:val="clear" w:color="auto" w:fill="BBD7EE"/>
           </w:tcPr>
           <w:p>
             <w:r>
-              <w:rPr>
-                <w:b/>
-                <w:sz w:val="18"/>
-              </w:rPr>
-              <w:t>Componente</w:t>
+              <w:t>Responsabilidade</w:t>
             </w:r>
           </w:p>
         </w:tc>
         <w:tc>
           <w:tcPr>
-            <w:tcW w:w="2448" w:type="dxa"/>
-            <w:shd w:val="clear" w:color="auto" w:fill="B7D7EE"/>
+            <w:tcW w:w="3360" w:type="dxa"/>
+            <w:shd w:val="clear" w:color="auto" w:fill="BBD7EE"/>
           </w:tcPr>
           <w:p>
             <w:r>
-              <w:rPr>
-                <w:b/>
-                <w:sz w:val="18"/>
-              </w:rPr>
               <w:t>Tecnologia</w:t>
-            </w:r>
-          </w:p>
-        </w:tc>
-        <w:tc>
-          <w:tcPr>
-            <w:tcW w:w="2448" w:type="dxa"/>
-            <w:shd w:val="clear" w:color="auto" w:fill="B7D7EE"/>
-          </w:tcPr>
-          <w:p>
-            <w:r>
-              <w:rPr>
-                <w:b/>
-                <w:sz w:val="18"/>
-              </w:rPr>
-              <w:t>Responsabilidade</w:t>
             </w:r>
           </w:p>
         </w:tc>
@@ -381,53 +285,31 @@
         </w:trPr>
         <w:tc>
           <w:tcPr>
-            <w:tcW w:w="2448" w:type="dxa"/>
+            <w:tcW w:w="3360" w:type="dxa"/>
           </w:tcPr>
           <w:p>
             <w:r>
-              <w:rPr>
-                <w:sz w:val="18"/>
-              </w:rPr>
-              <w:t>Administração</w:t>
+              <w:t>Servidor</w:t>
             </w:r>
           </w:p>
         </w:tc>
         <w:tc>
           <w:tcPr>
-            <w:tcW w:w="2448" w:type="dxa"/>
+            <w:tcW w:w="3360" w:type="dxa"/>
           </w:tcPr>
           <w:p>
             <w:r>
-              <w:rPr>
-                <w:sz w:val="18"/>
-              </w:rPr>
-              <w:t>Painel web</w:t>
+              <w:t>Painel administrativo, banco, mídias e API</w:t>
             </w:r>
           </w:p>
         </w:tc>
         <w:tc>
           <w:tcPr>
-            <w:tcW w:w="2448" w:type="dxa"/>
+            <w:tcW w:w="3360" w:type="dxa"/>
           </w:tcPr>
           <w:p>
             <w:r>
-              <w:rPr>
-                <w:sz w:val="18"/>
-              </w:rPr>
-              <w:t>Flask + HTML/CSS</w:t>
-            </w:r>
-          </w:p>
-        </w:tc>
-        <w:tc>
-          <w:tcPr>
-            <w:tcW w:w="2448" w:type="dxa"/>
-          </w:tcPr>
-          <w:p>
-            <w:r>
-              <w:rPr>
-                <w:sz w:val="18"/>
-              </w:rPr>
-              <w:t>Login, upload, organização da playlist, telas e publicação.</w:t>
+              <w:t>Python, Flask e SQLite</w:t>
             </w:r>
           </w:p>
         </w:tc>
@@ -438,53 +320,31 @@
         </w:trPr>
         <w:tc>
           <w:tcPr>
-            <w:tcW w:w="2448" w:type="dxa"/>
+            <w:tcW w:w="3360" w:type="dxa"/>
           </w:tcPr>
           <w:p>
             <w:r>
-              <w:rPr>
-                <w:sz w:val="18"/>
-              </w:rPr>
-              <w:t>Backend</w:t>
+              <w:t>Player</w:t>
             </w:r>
           </w:p>
         </w:tc>
         <w:tc>
           <w:tcPr>
-            <w:tcW w:w="2448" w:type="dxa"/>
+            <w:tcW w:w="3360" w:type="dxa"/>
           </w:tcPr>
           <w:p>
             <w:r>
-              <w:rPr>
-                <w:sz w:val="18"/>
-              </w:rPr>
-              <w:t>Servidor Flask</w:t>
+              <w:t>Exibição automática da playlist</w:t>
             </w:r>
           </w:p>
         </w:tc>
         <w:tc>
           <w:tcPr>
-            <w:tcW w:w="2448" w:type="dxa"/>
+            <w:tcW w:w="3360" w:type="dxa"/>
           </w:tcPr>
           <w:p>
             <w:r>
-              <w:rPr>
-                <w:sz w:val="18"/>
-              </w:rPr>
-              <w:t>Python + Flask</w:t>
-            </w:r>
-          </w:p>
-        </w:tc>
-        <w:tc>
-          <w:tcPr>
-            <w:tcW w:w="2448" w:type="dxa"/>
-          </w:tcPr>
-          <w:p>
-            <w:r>
-              <w:rPr>
-                <w:sz w:val="18"/>
-              </w:rPr>
-              <w:t>Rotas, sessões, API do player, banco SQLite e arquivos de mídia.</w:t>
+              <w:t>Flutter e WebView</w:t>
             </w:r>
           </w:p>
         </w:tc>
@@ -495,238 +355,36 @@
         </w:trPr>
         <w:tc>
           <w:tcPr>
-            <w:tcW w:w="2448" w:type="dxa"/>
+            <w:tcW w:w="3360" w:type="dxa"/>
           </w:tcPr>
           <w:p>
             <w:r>
-              <w:rPr>
-                <w:sz w:val="18"/>
-              </w:rPr>
-              <w:t>Dados</w:t>
+              <w:t>Interface web</w:t>
             </w:r>
           </w:p>
         </w:tc>
         <w:tc>
           <w:tcPr>
-            <w:tcW w:w="2448" w:type="dxa"/>
+            <w:tcW w:w="3360" w:type="dxa"/>
           </w:tcPr>
           <w:p>
             <w:r>
-              <w:rPr>
-                <w:sz w:val="18"/>
-              </w:rPr>
-              <w:t>Banco local</w:t>
+              <w:t>Painel administrativo e player web</w:t>
             </w:r>
           </w:p>
         </w:tc>
         <w:tc>
           <w:tcPr>
-            <w:tcW w:w="2448" w:type="dxa"/>
+            <w:tcW w:w="3360" w:type="dxa"/>
           </w:tcPr>
           <w:p>
             <w:r>
-              <w:rPr>
-                <w:sz w:val="18"/>
-              </w:rPr>
-              <w:t>SQLite</w:t>
-            </w:r>
-          </w:p>
-        </w:tc>
-        <w:tc>
-          <w:tcPr>
-            <w:tcW w:w="2448" w:type="dxa"/>
-          </w:tcPr>
-          <w:p>
-            <w:r>
-              <w:rPr>
-                <w:sz w:val="18"/>
-              </w:rPr>
-              <w:t>Usuários, mídias, playlist, telas cadastradas e histórico de publicações.</w:t>
-            </w:r>
-          </w:p>
-        </w:tc>
-      </w:tr>
-      <w:tr>
-        <w:trPr>
-          <w:jc w:val="center"/>
-        </w:trPr>
-        <w:tc>
-          <w:tcPr>
-            <w:tcW w:w="2448" w:type="dxa"/>
-          </w:tcPr>
-          <w:p>
-            <w:r>
-              <w:rPr>
-                <w:sz w:val="18"/>
-              </w:rPr>
-              <w:t>Mídias</w:t>
-            </w:r>
-          </w:p>
-        </w:tc>
-        <w:tc>
-          <w:tcPr>
-            <w:tcW w:w="2448" w:type="dxa"/>
-          </w:tcPr>
-          <w:p>
-            <w:r>
-              <w:rPr>
-                <w:sz w:val="18"/>
-              </w:rPr>
-              <w:t>Pasta media</w:t>
-            </w:r>
-          </w:p>
-        </w:tc>
-        <w:tc>
-          <w:tcPr>
-            <w:tcW w:w="2448" w:type="dxa"/>
-          </w:tcPr>
-          <w:p>
-            <w:r>
-              <w:rPr>
-                <w:sz w:val="18"/>
-              </w:rPr>
-              <w:t>Sistema de arquivos</w:t>
-            </w:r>
-          </w:p>
-        </w:tc>
-        <w:tc>
-          <w:tcPr>
-            <w:tcW w:w="2448" w:type="dxa"/>
-          </w:tcPr>
-          <w:p>
-            <w:r>
-              <w:rPr>
-                <w:sz w:val="18"/>
-              </w:rPr>
-              <w:t>Armazena imagens e vídeos enviados pelo painel.</w:t>
-            </w:r>
-          </w:p>
-        </w:tc>
-      </w:tr>
-      <w:tr>
-        <w:trPr>
-          <w:jc w:val="center"/>
-        </w:trPr>
-        <w:tc>
-          <w:tcPr>
-            <w:tcW w:w="2448" w:type="dxa"/>
-          </w:tcPr>
-          <w:p>
-            <w:r>
-              <w:rPr>
-                <w:sz w:val="18"/>
-              </w:rPr>
-              <w:t>Player web</w:t>
-            </w:r>
-          </w:p>
-        </w:tc>
-        <w:tc>
-          <w:tcPr>
-            <w:tcW w:w="2448" w:type="dxa"/>
-          </w:tcPr>
-          <w:p>
-            <w:r>
-              <w:rPr>
-                <w:sz w:val="18"/>
-              </w:rPr>
-              <w:t>Página /player/&lt;codigo&gt;</w:t>
-            </w:r>
-          </w:p>
-        </w:tc>
-        <w:tc>
-          <w:tcPr>
-            <w:tcW w:w="2448" w:type="dxa"/>
-          </w:tcPr>
-          <w:p>
-            <w:r>
-              <w:rPr>
-                <w:sz w:val="18"/>
-              </w:rPr>
-              <w:t>HTML/CSS/JavaScript</w:t>
-            </w:r>
-          </w:p>
-        </w:tc>
-        <w:tc>
-          <w:tcPr>
-            <w:tcW w:w="2448" w:type="dxa"/>
-          </w:tcPr>
-          <w:p>
-            <w:r>
-              <w:rPr>
-                <w:sz w:val="18"/>
-              </w:rPr>
-              <w:t>Exibe slides, vídeos, barra inferior e progresso.</w:t>
-            </w:r>
-          </w:p>
-        </w:tc>
-      </w:tr>
-      <w:tr>
-        <w:trPr>
-          <w:jc w:val="center"/>
-        </w:trPr>
-        <w:tc>
-          <w:tcPr>
-            <w:tcW w:w="2448" w:type="dxa"/>
-          </w:tcPr>
-          <w:p>
-            <w:r>
-              <w:rPr>
-                <w:sz w:val="18"/>
-              </w:rPr>
-              <w:t>Aplicativo Android</w:t>
-            </w:r>
-          </w:p>
-        </w:tc>
-        <w:tc>
-          <w:tcPr>
-            <w:tcW w:w="2448" w:type="dxa"/>
-          </w:tcPr>
-          <w:p>
-            <w:r>
-              <w:rPr>
-                <w:sz w:val="18"/>
-              </w:rPr>
-              <w:t>Flutter WebView</w:t>
-            </w:r>
-          </w:p>
-        </w:tc>
-        <w:tc>
-          <w:tcPr>
-            <w:tcW w:w="2448" w:type="dxa"/>
-          </w:tcPr>
-          <w:p>
-            <w:r>
-              <w:rPr>
-                <w:sz w:val="18"/>
-              </w:rPr>
-              <w:t>Flutter + webview_flutter</w:t>
-            </w:r>
-          </w:p>
-        </w:tc>
-        <w:tc>
-          <w:tcPr>
-            <w:tcW w:w="2448" w:type="dxa"/>
-          </w:tcPr>
-          <w:p>
-            <w:r>
-              <w:rPr>
-                <w:sz w:val="18"/>
-              </w:rPr>
-              <w:t>Abre o player em tela cheia no dispositivo Android/TV Box.</w:t>
+              <w:t>HTML, CSS e JavaScript</w:t>
             </w:r>
           </w:p>
         </w:tc>
       </w:tr>
     </w:tbl>
-    <w:p/>
-    <w:p>
-      <w:pPr>
-        <w:jc w:val="both"/>
-      </w:pPr>
-      <w:r>
-        <w:t>Fluxo lógico: o administrador acessa o painel, envia mídias, organiza a playlist e publica. O servidor disponibiliza a playlist em uma API JSON. O player consulta essa API periodicamente, baixa as mídias pelo endereço do servidor e exibe o conteúdo nas telas cadastradas.</w:t>
-      </w:r>
-    </w:p>
     <w:p>
       <w:pPr>
         <w:pStyle w:val="Ttulo1"/>
@@ -737,14 +395,15 @@
     </w:p>
     <w:tbl>
       <w:tblPr>
+        <w:tblStyle w:val="Tabelacomgrade"/>
         <w:tblW w:w="0" w:type="auto"/>
         <w:jc w:val="center"/>
         <w:tblLook w:val="04A0" w:firstRow="1" w:lastRow="0" w:firstColumn="1" w:lastColumn="0" w:noHBand="0" w:noVBand="1"/>
       </w:tblPr>
       <w:tblGrid>
-        <w:gridCol w:w="3264"/>
-        <w:gridCol w:w="3264"/>
-        <w:gridCol w:w="3264"/>
+        <w:gridCol w:w="3360"/>
+        <w:gridCol w:w="3360"/>
+        <w:gridCol w:w="3360"/>
       </w:tblGrid>
       <w:tr>
         <w:trPr>
@@ -752,45 +411,33 @@
         </w:trPr>
         <w:tc>
           <w:tcPr>
-            <w:tcW w:w="3264" w:type="dxa"/>
-            <w:shd w:val="clear" w:color="auto" w:fill="B7D7EE"/>
+            <w:tcW w:w="3360" w:type="dxa"/>
+            <w:shd w:val="clear" w:color="auto" w:fill="BBD7EE"/>
           </w:tcPr>
           <w:p>
             <w:r>
-              <w:rPr>
-                <w:b/>
-                <w:sz w:val="18"/>
-              </w:rPr>
               <w:t>Tecnologia</w:t>
             </w:r>
           </w:p>
         </w:tc>
         <w:tc>
           <w:tcPr>
-            <w:tcW w:w="3264" w:type="dxa"/>
-            <w:shd w:val="clear" w:color="auto" w:fill="B7D7EE"/>
+            <w:tcW w:w="3360" w:type="dxa"/>
+            <w:shd w:val="clear" w:color="auto" w:fill="BBD7EE"/>
           </w:tcPr>
           <w:p>
             <w:r>
-              <w:rPr>
-                <w:b/>
-                <w:sz w:val="18"/>
-              </w:rPr>
-              <w:t>Uso no projeto</w:t>
+              <w:t>Uso</w:t>
             </w:r>
           </w:p>
         </w:tc>
         <w:tc>
           <w:tcPr>
-            <w:tcW w:w="3264" w:type="dxa"/>
-            <w:shd w:val="clear" w:color="auto" w:fill="B7D7EE"/>
+            <w:tcW w:w="3360" w:type="dxa"/>
+            <w:shd w:val="clear" w:color="auto" w:fill="BBD7EE"/>
           </w:tcPr>
           <w:p>
             <w:r>
-              <w:rPr>
-                <w:b/>
-                <w:sz w:val="18"/>
-              </w:rPr>
               <w:t>Observação</w:t>
             </w:r>
           </w:p>
@@ -802,40 +449,31 @@
         </w:trPr>
         <w:tc>
           <w:tcPr>
-            <w:tcW w:w="3264" w:type="dxa"/>
+            <w:tcW w:w="3360" w:type="dxa"/>
           </w:tcPr>
           <w:p>
             <w:r>
-              <w:rPr>
-                <w:sz w:val="18"/>
-              </w:rPr>
               <w:t>Python</w:t>
             </w:r>
           </w:p>
         </w:tc>
         <w:tc>
           <w:tcPr>
-            <w:tcW w:w="3264" w:type="dxa"/>
+            <w:tcW w:w="3360" w:type="dxa"/>
           </w:tcPr>
           <w:p>
             <w:r>
-              <w:rPr>
-                <w:sz w:val="18"/>
-              </w:rPr>
-              <w:t>Servidor principal</w:t>
+              <w:t>Backend</w:t>
             </w:r>
           </w:p>
         </w:tc>
         <w:tc>
           <w:tcPr>
-            <w:tcW w:w="3264" w:type="dxa"/>
+            <w:tcW w:w="3360" w:type="dxa"/>
           </w:tcPr>
           <w:p>
             <w:r>
-              <w:rPr>
-                <w:sz w:val="18"/>
-              </w:rPr>
-              <w:t>Linguagem usada no backend.</w:t>
+              <w:t>Execução do servidor</w:t>
             </w:r>
           </w:p>
         </w:tc>
@@ -846,40 +484,31 @@
         </w:trPr>
         <w:tc>
           <w:tcPr>
-            <w:tcW w:w="3264" w:type="dxa"/>
+            <w:tcW w:w="3360" w:type="dxa"/>
           </w:tcPr>
           <w:p>
             <w:r>
-              <w:rPr>
-                <w:sz w:val="18"/>
-              </w:rPr>
               <w:t>Flask</w:t>
             </w:r>
           </w:p>
         </w:tc>
         <w:tc>
           <w:tcPr>
-            <w:tcW w:w="3264" w:type="dxa"/>
+            <w:tcW w:w="3360" w:type="dxa"/>
           </w:tcPr>
           <w:p>
             <w:r>
-              <w:rPr>
-                <w:sz w:val="18"/>
-              </w:rPr>
               <w:t>Aplicação web</w:t>
             </w:r>
           </w:p>
         </w:tc>
         <w:tc>
           <w:tcPr>
-            <w:tcW w:w="3264" w:type="dxa"/>
+            <w:tcW w:w="3360" w:type="dxa"/>
           </w:tcPr>
           <w:p>
             <w:r>
-              <w:rPr>
-                <w:sz w:val="18"/>
-              </w:rPr>
-              <w:t>Painel administrativo, rotas, API e servidor de mídia.</w:t>
+              <w:t>Painel, rotas e API</w:t>
             </w:r>
           </w:p>
         </w:tc>
@@ -890,40 +519,31 @@
         </w:trPr>
         <w:tc>
           <w:tcPr>
-            <w:tcW w:w="3264" w:type="dxa"/>
+            <w:tcW w:w="3360" w:type="dxa"/>
           </w:tcPr>
           <w:p>
             <w:r>
-              <w:rPr>
-                <w:sz w:val="18"/>
-              </w:rPr>
               <w:t>SQLite</w:t>
             </w:r>
           </w:p>
         </w:tc>
         <w:tc>
           <w:tcPr>
-            <w:tcW w:w="3264" w:type="dxa"/>
+            <w:tcW w:w="3360" w:type="dxa"/>
           </w:tcPr>
           <w:p>
             <w:r>
-              <w:rPr>
-                <w:sz w:val="18"/>
-              </w:rPr>
               <w:t>Banco de dados</w:t>
             </w:r>
           </w:p>
         </w:tc>
         <w:tc>
           <w:tcPr>
-            <w:tcW w:w="3264" w:type="dxa"/>
+            <w:tcW w:w="3360" w:type="dxa"/>
           </w:tcPr>
           <w:p>
             <w:r>
-              <w:rPr>
-                <w:sz w:val="18"/>
-              </w:rPr>
-              <w:t>Banco local simples para o MVP.</w:t>
+              <w:t>Adequado ao MVP</w:t>
             </w:r>
           </w:p>
         </w:tc>
@@ -934,40 +554,31 @@
         </w:trPr>
         <w:tc>
           <w:tcPr>
-            <w:tcW w:w="3264" w:type="dxa"/>
+            <w:tcW w:w="3360" w:type="dxa"/>
           </w:tcPr>
           <w:p>
             <w:r>
-              <w:rPr>
-                <w:sz w:val="18"/>
-              </w:rPr>
               <w:t>HTML/CSS/JavaScript</w:t>
             </w:r>
           </w:p>
         </w:tc>
         <w:tc>
           <w:tcPr>
-            <w:tcW w:w="3264" w:type="dxa"/>
+            <w:tcW w:w="3360" w:type="dxa"/>
           </w:tcPr>
           <w:p>
             <w:r>
-              <w:rPr>
-                <w:sz w:val="18"/>
-              </w:rPr>
-              <w:t>Interface web e player</w:t>
+              <w:t>Interface</w:t>
             </w:r>
           </w:p>
         </w:tc>
         <w:tc>
           <w:tcPr>
-            <w:tcW w:w="3264" w:type="dxa"/>
+            <w:tcW w:w="3360" w:type="dxa"/>
           </w:tcPr>
           <w:p>
             <w:r>
-              <w:rPr>
-                <w:sz w:val="18"/>
-              </w:rPr>
-              <w:t>Templates do painel, player e animação dos slides.</w:t>
+              <w:t>Painel e player web</w:t>
             </w:r>
           </w:p>
         </w:tc>
@@ -978,40 +589,31 @@
         </w:trPr>
         <w:tc>
           <w:tcPr>
-            <w:tcW w:w="3264" w:type="dxa"/>
+            <w:tcW w:w="3360" w:type="dxa"/>
           </w:tcPr>
           <w:p>
             <w:r>
-              <w:rPr>
-                <w:sz w:val="18"/>
-              </w:rPr>
               <w:t>Flutter</w:t>
             </w:r>
           </w:p>
         </w:tc>
         <w:tc>
           <w:tcPr>
-            <w:tcW w:w="3264" w:type="dxa"/>
+            <w:tcW w:w="3360" w:type="dxa"/>
           </w:tcPr>
           <w:p>
             <w:r>
-              <w:rPr>
-                <w:sz w:val="18"/>
-              </w:rPr>
               <w:t>Aplicativo Android</w:t>
             </w:r>
           </w:p>
         </w:tc>
         <w:tc>
           <w:tcPr>
-            <w:tcW w:w="3264" w:type="dxa"/>
+            <w:tcW w:w="3360" w:type="dxa"/>
           </w:tcPr>
           <w:p>
             <w:r>
-              <w:rPr>
-                <w:sz w:val="18"/>
-              </w:rPr>
-              <w:t>Base do app que roda em TV Box ou aparelho Android.</w:t>
+              <w:t>Player para TV Box ou dispositivo Android</w:t>
             </w:r>
           </w:p>
         </w:tc>
@@ -1022,128 +624,31 @@
         </w:trPr>
         <w:tc>
           <w:tcPr>
-            <w:tcW w:w="3264" w:type="dxa"/>
+            <w:tcW w:w="3360" w:type="dxa"/>
           </w:tcPr>
           <w:p>
             <w:r>
-              <w:rPr>
-                <w:sz w:val="18"/>
-              </w:rPr>
-              <w:t>webview_flutter</w:t>
+              <w:t>WebView</w:t>
             </w:r>
           </w:p>
         </w:tc>
         <w:tc>
           <w:tcPr>
-            <w:tcW w:w="3264" w:type="dxa"/>
+            <w:tcW w:w="3360" w:type="dxa"/>
           </w:tcPr>
           <w:p>
             <w:r>
-              <w:rPr>
-                <w:sz w:val="18"/>
-              </w:rPr>
-              <w:t>Player Android</w:t>
+              <w:t>Renderização do player</w:t>
             </w:r>
           </w:p>
         </w:tc>
         <w:tc>
           <w:tcPr>
-            <w:tcW w:w="3264" w:type="dxa"/>
+            <w:tcW w:w="3360" w:type="dxa"/>
           </w:tcPr>
           <w:p>
             <w:r>
-              <w:rPr>
-                <w:sz w:val="18"/>
-              </w:rPr>
-              <w:t>Componente que carrega o endereço do player no app.</w:t>
-            </w:r>
-          </w:p>
-        </w:tc>
-      </w:tr>
-      <w:tr>
-        <w:trPr>
-          <w:jc w:val="center"/>
-        </w:trPr>
-        <w:tc>
-          <w:tcPr>
-            <w:tcW w:w="3264" w:type="dxa"/>
-          </w:tcPr>
-          <w:p>
-            <w:r>
-              <w:rPr>
-                <w:sz w:val="18"/>
-              </w:rPr>
-              <w:t>Werkzeug</w:t>
-            </w:r>
-          </w:p>
-        </w:tc>
-        <w:tc>
-          <w:tcPr>
-            <w:tcW w:w="3264" w:type="dxa"/>
-          </w:tcPr>
-          <w:p>
-            <w:r>
-              <w:rPr>
-                <w:sz w:val="18"/>
-              </w:rPr>
-              <w:t>Segurança e upload</w:t>
-            </w:r>
-          </w:p>
-        </w:tc>
-        <w:tc>
-          <w:tcPr>
-            <w:tcW w:w="3264" w:type="dxa"/>
-          </w:tcPr>
-          <w:p>
-            <w:r>
-              <w:rPr>
-                <w:sz w:val="18"/>
-              </w:rPr>
-              <w:t>Hash de senha e nomes seguros de arquivos.</w:t>
-            </w:r>
-          </w:p>
-        </w:tc>
-      </w:tr>
-      <w:tr>
-        <w:trPr>
-          <w:jc w:val="center"/>
-        </w:trPr>
-        <w:tc>
-          <w:tcPr>
-            <w:tcW w:w="3264" w:type="dxa"/>
-          </w:tcPr>
-          <w:p>
-            <w:r>
-              <w:rPr>
-                <w:sz w:val="18"/>
-              </w:rPr>
-              <w:t>TV Box Android / PCs reaproveitados</w:t>
-            </w:r>
-          </w:p>
-        </w:tc>
-        <w:tc>
-          <w:tcPr>
-            <w:tcW w:w="3264" w:type="dxa"/>
-          </w:tcPr>
-          <w:p>
-            <w:r>
-              <w:rPr>
-                <w:sz w:val="18"/>
-              </w:rPr>
-              <w:t>Terminais de exibição</w:t>
-            </w:r>
-          </w:p>
-        </w:tc>
-        <w:tc>
-          <w:tcPr>
-            <w:tcW w:w="3264" w:type="dxa"/>
-          </w:tcPr>
-          <w:p>
-            <w:r>
-              <w:rPr>
-                <w:sz w:val="18"/>
-              </w:rPr>
-              <w:t>Reduzem custo e descarte eletrônico.</w:t>
+              <w:t>Exibe a interface web dentro do app</w:t>
             </w:r>
           </w:p>
         </w:tc>
@@ -1158,169 +663,104 @@
       </w:r>
     </w:p>
     <w:p>
-      <w:pPr>
-        <w:jc w:val="both"/>
-      </w:pPr>
-      <w:r>
-        <w:t>A estrutura observada no pacote atual é organizada em duas frentes: servidor Flask e aplicativo Android/Flutter.</w:t>
-      </w:r>
-    </w:p>
-    <w:p>
       <w:r>
         <w:rPr>
-          <w:rFonts w:ascii="Courier New" w:hAnsi="Courier New"/>
-          <w:sz w:val="17"/>
+          <w:rFonts w:ascii="Courier New" w:eastAsia="Courier New" w:hAnsi="Courier New"/>
+          <w:sz w:val="18"/>
         </w:rPr>
         <w:t>ProjetoConectaCampus/</w:t>
       </w:r>
       <w:r>
         <w:rPr>
-          <w:rFonts w:ascii="Courier New" w:hAnsi="Courier New"/>
-          <w:sz w:val="17"/>
+          <w:rFonts w:ascii="Courier New" w:eastAsia="Courier New" w:hAnsi="Courier New"/>
+          <w:sz w:val="18"/>
         </w:rPr>
         <w:br/>
         <w:t>├── servidor_flask/</w:t>
       </w:r>
       <w:r>
         <w:rPr>
-          <w:rFonts w:ascii="Courier New" w:hAnsi="Courier New"/>
-          <w:sz w:val="17"/>
+          <w:rFonts w:ascii="Courier New" w:eastAsia="Courier New" w:hAnsi="Courier New"/>
+          <w:sz w:val="18"/>
         </w:rPr>
         <w:br/>
         <w:t>│   ├── app.py</w:t>
       </w:r>
       <w:r>
         <w:rPr>
-          <w:rFonts w:ascii="Courier New" w:hAnsi="Courier New"/>
-          <w:sz w:val="17"/>
+          <w:rFonts w:ascii="Courier New" w:eastAsia="Courier New" w:hAnsi="Courier New"/>
+          <w:sz w:val="18"/>
         </w:rPr>
         <w:br/>
         <w:t>│   ├── wsgi.py</w:t>
       </w:r>
       <w:r>
         <w:rPr>
-          <w:rFonts w:ascii="Courier New" w:hAnsi="Courier New"/>
-          <w:sz w:val="17"/>
+          <w:rFonts w:ascii="Courier New" w:eastAsia="Courier New" w:hAnsi="Courier New"/>
+          <w:sz w:val="18"/>
         </w:rPr>
         <w:br/>
+      </w:r>
+      <w:r>
+        <w:rPr>
+          <w:rFonts w:ascii="Courier New" w:eastAsia="Courier New" w:hAnsi="Courier New"/>
+          <w:sz w:val="18"/>
+        </w:rPr>
+        <w:lastRenderedPageBreak/>
         <w:t>│   ├── requirements.txt</w:t>
       </w:r>
       <w:r>
         <w:rPr>
-          <w:rFonts w:ascii="Courier New" w:hAnsi="Courier New"/>
-          <w:sz w:val="17"/>
+          <w:rFonts w:ascii="Courier New" w:eastAsia="Courier New" w:hAnsi="Courier New"/>
+          <w:sz w:val="18"/>
         </w:rPr>
         <w:br/>
         <w:t>│   ├── painel.db</w:t>
       </w:r>
       <w:r>
         <w:rPr>
-          <w:rFonts w:ascii="Courier New" w:hAnsi="Courier New"/>
-          <w:sz w:val="17"/>
+          <w:rFonts w:ascii="Courier New" w:eastAsia="Courier New" w:hAnsi="Courier New"/>
+          <w:sz w:val="18"/>
         </w:rPr>
         <w:br/>
         <w:t>│   ├── media/</w:t>
       </w:r>
       <w:r>
         <w:rPr>
-          <w:rFonts w:ascii="Courier New" w:hAnsi="Courier New"/>
-          <w:sz w:val="17"/>
+          <w:rFonts w:ascii="Courier New" w:eastAsia="Courier New" w:hAnsi="Courier New"/>
+          <w:sz w:val="18"/>
         </w:rPr>
         <w:br/>
         <w:t>│   ├── static/</w:t>
       </w:r>
       <w:r>
         <w:rPr>
-          <w:rFonts w:ascii="Courier New" w:hAnsi="Courier New"/>
-          <w:sz w:val="17"/>
-        </w:rPr>
-        <w:br/>
-        <w:t>│   │   ├── style.css</w:t>
-      </w:r>
-      <w:r>
-        <w:rPr>
-          <w:rFonts w:ascii="Courier New" w:hAnsi="Courier New"/>
-          <w:sz w:val="17"/>
-        </w:rPr>
-        <w:br/>
-        <w:t>│   │   ├── player.css</w:t>
-      </w:r>
-      <w:r>
-        <w:rPr>
-          <w:rFonts w:ascii="Courier New" w:hAnsi="Courier New"/>
-          <w:sz w:val="17"/>
-        </w:rPr>
-        <w:br/>
-        <w:t>│   │   └── player.js</w:t>
-      </w:r>
-      <w:r>
-        <w:rPr>
-          <w:rFonts w:ascii="Courier New" w:hAnsi="Courier New"/>
-          <w:sz w:val="17"/>
+          <w:rFonts w:ascii="Courier New" w:eastAsia="Courier New" w:hAnsi="Courier New"/>
+          <w:sz w:val="18"/>
         </w:rPr>
         <w:br/>
         <w:t>│   └── templates/</w:t>
       </w:r>
       <w:r>
         <w:rPr>
-          <w:rFonts w:ascii="Courier New" w:hAnsi="Courier New"/>
-          <w:sz w:val="17"/>
-        </w:rPr>
-        <w:br/>
-        <w:t>│       ├── login.html</w:t>
-      </w:r>
-      <w:r>
-        <w:rPr>
-          <w:rFonts w:ascii="Courier New" w:hAnsi="Courier New"/>
-          <w:sz w:val="17"/>
-        </w:rPr>
-        <w:br/>
-        <w:t>│       ├── register.html</w:t>
-      </w:r>
-      <w:r>
-        <w:rPr>
-          <w:rFonts w:ascii="Courier New" w:hAnsi="Courier New"/>
-          <w:sz w:val="17"/>
-        </w:rPr>
-        <w:br/>
-        <w:t>│       ├── admin.html</w:t>
-      </w:r>
-      <w:r>
-        <w:rPr>
-          <w:rFonts w:ascii="Courier New" w:hAnsi="Courier New"/>
-          <w:sz w:val="17"/>
-        </w:rPr>
-        <w:br/>
-        <w:t>│       └── player.html</w:t>
-      </w:r>
-      <w:r>
-        <w:rPr>
-          <w:rFonts w:ascii="Courier New" w:hAnsi="Courier New"/>
-          <w:sz w:val="17"/>
+          <w:rFonts w:ascii="Courier New" w:eastAsia="Courier New" w:hAnsi="Courier New"/>
+          <w:sz w:val="18"/>
         </w:rPr>
         <w:br/>
         <w:t>└── android_player_builder/</w:t>
       </w:r>
       <w:r>
         <w:rPr>
-          <w:rFonts w:ascii="Courier New" w:hAnsi="Courier New"/>
-          <w:sz w:val="17"/>
+          <w:rFonts w:ascii="Courier New" w:eastAsia="Courier New" w:hAnsi="Courier New"/>
+          <w:sz w:val="18"/>
         </w:rPr>
         <w:br/>
         <w:t xml:space="preserve">    ├── main.dart</w:t>
       </w:r>
       <w:r>
         <w:rPr>
-          <w:rFonts w:ascii="Courier New" w:hAnsi="Courier New"/>
-          <w:sz w:val="17"/>
-        </w:rPr>
-        <w:br/>
-        <w:t xml:space="preserve">    ├── AndroidManifest.xml</w:t>
-      </w:r>
-      <w:r>
-        <w:rPr>
-          <w:rFonts w:ascii="Courier New" w:hAnsi="Courier New"/>
-          <w:sz w:val="17"/>
+          <w:rFonts w:ascii="Courier New" w:eastAsia="Courier New" w:hAnsi="Courier New"/>
+          <w:sz w:val="18"/>
         </w:rPr>
         <w:br/>
         <w:t xml:space="preserve">    └── conecta_campus_player_ok/</w:t>
@@ -1331,69 +771,52 @@
         <w:pStyle w:val="Ttulo1"/>
       </w:pPr>
       <w:r>
-        <w:lastRenderedPageBreak/>
         <w:t>6. Funcionamento do servidor Flask</w:t>
       </w:r>
     </w:p>
     <w:p>
-      <w:pPr>
-        <w:jc w:val="both"/>
-      </w:pPr>
       <w:r>
-        <w:t>O arquivo principal do servidor é app.py. Ele inicializa a aplicação Flask, cria o banco SQLite caso ainda não exista, garante a pasta de mídias e registra as rotas necessárias para login, cadastro, painel administrativo, envio de arquivos, playlist, telas, publicação e player.</w:t>
+        <w:t>O arquivo app.py inicializa a aplicação Flask, cria o banco SQLite quando necessário, garante a pasta de mídias e registra as rotas do painel, upload, playlist, publicação e player. O banco painel.db armazena usuários, mídias, itens da playlist, telas e registros básicos de publicação.</w:t>
       </w:r>
     </w:p>
     <w:p>
       <w:pPr>
-        <w:jc w:val="both"/>
+        <w:pStyle w:val="Commarcadores"/>
       </w:pPr>
       <w:r>
-        <w:t>O banco painel.db é criado automaticamente com as tabelas usuarios, midias, playlist_itens, telas e publicacoes. O usuário inicial é admin, com senha admin123, permitindo o primeiro acesso ao painel. Após a instalação, recomenda-se criar um novo usuário administrativo e alterar as credenciais padrão.</w:t>
+        <w:t>usuarios: login, senha em hash e data de criação.</w:t>
       </w:r>
     </w:p>
     <w:p>
       <w:pPr>
         <w:pStyle w:val="Commarcadores"/>
-        <w:jc w:val="both"/>
       </w:pPr>
       <w:r>
-        <w:t>usuarios: armazena login, senha em hash e data de criação.</w:t>
+        <w:t>midias: nome original, arquivo salvo, tipo e data de criação.</w:t>
       </w:r>
     </w:p>
     <w:p>
       <w:pPr>
         <w:pStyle w:val="Commarcadores"/>
-        <w:jc w:val="both"/>
       </w:pPr>
       <w:r>
-        <w:t>midias: armazena nome original, arquivo salvo, tipo e data de criação.</w:t>
+        <w:t>playlist_itens: ordem e duração de cada mídia exibida.</w:t>
       </w:r>
     </w:p>
     <w:p>
       <w:pPr>
         <w:pStyle w:val="Commarcadores"/>
-        <w:jc w:val="both"/>
       </w:pPr>
       <w:r>
-        <w:t>playlist_itens: define ordem e duração de cada mídia exibida.</w:t>
+        <w:t>telas: códigos dos players e último acesso registrado.</w:t>
       </w:r>
     </w:p>
     <w:p>
       <w:pPr>
         <w:pStyle w:val="Commarcadores"/>
-        <w:jc w:val="both"/>
       </w:pPr>
       <w:r>
-        <w:t>telas: registra os códigos dos players e o último acesso.</w:t>
-      </w:r>
-    </w:p>
-    <w:p>
-      <w:pPr>
-        <w:pStyle w:val="Commarcadores"/>
-        <w:jc w:val="both"/>
-      </w:pPr>
-      <w:r>
-        <w:t>publicacoes: registra o histórico básico de publicações realizadas.</w:t>
+        <w:t>publicacoes: histórico básico das publicações realizadas.</w:t>
       </w:r>
     </w:p>
     <w:p>
@@ -1406,14 +829,15 @@
     </w:p>
     <w:tbl>
       <w:tblPr>
+        <w:tblStyle w:val="Tabelacomgrade"/>
         <w:tblW w:w="0" w:type="auto"/>
         <w:jc w:val="center"/>
         <w:tblLook w:val="04A0" w:firstRow="1" w:lastRow="0" w:firstColumn="1" w:lastColumn="0" w:noHBand="0" w:noVBand="1"/>
       </w:tblPr>
       <w:tblGrid>
-        <w:gridCol w:w="3264"/>
-        <w:gridCol w:w="3264"/>
-        <w:gridCol w:w="3264"/>
+        <w:gridCol w:w="3360"/>
+        <w:gridCol w:w="3360"/>
+        <w:gridCol w:w="3360"/>
       </w:tblGrid>
       <w:tr>
         <w:trPr>
@@ -1421,45 +845,33 @@
         </w:trPr>
         <w:tc>
           <w:tcPr>
-            <w:tcW w:w="3264" w:type="dxa"/>
-            <w:shd w:val="clear" w:color="auto" w:fill="B7D7EE"/>
+            <w:tcW w:w="3360" w:type="dxa"/>
+            <w:shd w:val="clear" w:color="auto" w:fill="BBD7EE"/>
           </w:tcPr>
           <w:p>
             <w:r>
-              <w:rPr>
-                <w:b/>
-                <w:sz w:val="18"/>
-              </w:rPr>
               <w:t>Rota</w:t>
             </w:r>
           </w:p>
         </w:tc>
         <w:tc>
           <w:tcPr>
-            <w:tcW w:w="3264" w:type="dxa"/>
-            <w:shd w:val="clear" w:color="auto" w:fill="B7D7EE"/>
+            <w:tcW w:w="3360" w:type="dxa"/>
+            <w:shd w:val="clear" w:color="auto" w:fill="BBD7EE"/>
           </w:tcPr>
           <w:p>
             <w:r>
-              <w:rPr>
-                <w:b/>
-                <w:sz w:val="18"/>
-              </w:rPr>
               <w:t>Tipo</w:t>
             </w:r>
           </w:p>
         </w:tc>
         <w:tc>
           <w:tcPr>
-            <w:tcW w:w="3264" w:type="dxa"/>
-            <w:shd w:val="clear" w:color="auto" w:fill="B7D7EE"/>
+            <w:tcW w:w="3360" w:type="dxa"/>
+            <w:shd w:val="clear" w:color="auto" w:fill="BBD7EE"/>
           </w:tcPr>
           <w:p>
             <w:r>
-              <w:rPr>
-                <w:b/>
-                <w:sz w:val="18"/>
-              </w:rPr>
               <w:t>Função</w:t>
             </w:r>
           </w:p>
@@ -1471,40 +883,31 @@
         </w:trPr>
         <w:tc>
           <w:tcPr>
-            <w:tcW w:w="3264" w:type="dxa"/>
+            <w:tcW w:w="3360" w:type="dxa"/>
           </w:tcPr>
           <w:p>
             <w:r>
-              <w:rPr>
-                <w:sz w:val="18"/>
-              </w:rPr>
-              <w:t>/</w:t>
+              <w:t>/login</w:t>
             </w:r>
           </w:p>
         </w:tc>
         <w:tc>
           <w:tcPr>
-            <w:tcW w:w="3264" w:type="dxa"/>
+            <w:tcW w:w="3360" w:type="dxa"/>
           </w:tcPr>
           <w:p>
             <w:r>
-              <w:rPr>
-                <w:sz w:val="18"/>
-              </w:rPr>
-              <w:t>Web</w:t>
+              <w:t>GET/POST</w:t>
             </w:r>
           </w:p>
         </w:tc>
         <w:tc>
           <w:tcPr>
-            <w:tcW w:w="3264" w:type="dxa"/>
+            <w:tcW w:w="3360" w:type="dxa"/>
           </w:tcPr>
           <w:p>
             <w:r>
-              <w:rPr>
-                <w:sz w:val="18"/>
-              </w:rPr>
-              <w:t>Redireciona para o painel administrativo.</w:t>
+              <w:t>Autenticação administrativa</w:t>
             </w:r>
           </w:p>
         </w:tc>
@@ -1515,40 +918,31 @@
         </w:trPr>
         <w:tc>
           <w:tcPr>
-            <w:tcW w:w="3264" w:type="dxa"/>
+            <w:tcW w:w="3360" w:type="dxa"/>
           </w:tcPr>
           <w:p>
             <w:r>
-              <w:rPr>
-                <w:sz w:val="18"/>
-              </w:rPr>
-              <w:t>/login</w:t>
+              <w:t>/register</w:t>
             </w:r>
           </w:p>
         </w:tc>
         <w:tc>
           <w:tcPr>
-            <w:tcW w:w="3264" w:type="dxa"/>
+            <w:tcW w:w="3360" w:type="dxa"/>
           </w:tcPr>
           <w:p>
             <w:r>
-              <w:rPr>
-                <w:sz w:val="18"/>
-              </w:rPr>
-              <w:t>Web</w:t>
+              <w:t>GET/POST</w:t>
             </w:r>
           </w:p>
         </w:tc>
         <w:tc>
           <w:tcPr>
-            <w:tcW w:w="3264" w:type="dxa"/>
+            <w:tcW w:w="3360" w:type="dxa"/>
           </w:tcPr>
           <w:p>
             <w:r>
-              <w:rPr>
-                <w:sz w:val="18"/>
-              </w:rPr>
-              <w:t>Tela de autenticação.</w:t>
+              <w:t>Cadastro de usuário administrativo</w:t>
             </w:r>
           </w:p>
         </w:tc>
@@ -1559,40 +953,31 @@
         </w:trPr>
         <w:tc>
           <w:tcPr>
-            <w:tcW w:w="3264" w:type="dxa"/>
+            <w:tcW w:w="3360" w:type="dxa"/>
           </w:tcPr>
           <w:p>
             <w:r>
-              <w:rPr>
-                <w:sz w:val="18"/>
-              </w:rPr>
-              <w:t>/register</w:t>
+              <w:t>/admin</w:t>
             </w:r>
           </w:p>
         </w:tc>
         <w:tc>
           <w:tcPr>
-            <w:tcW w:w="3264" w:type="dxa"/>
+            <w:tcW w:w="3360" w:type="dxa"/>
           </w:tcPr>
           <w:p>
             <w:r>
-              <w:rPr>
-                <w:sz w:val="18"/>
-              </w:rPr>
-              <w:t>Web</w:t>
+              <w:t>GET</w:t>
             </w:r>
           </w:p>
         </w:tc>
         <w:tc>
           <w:tcPr>
-            <w:tcW w:w="3264" w:type="dxa"/>
+            <w:tcW w:w="3360" w:type="dxa"/>
           </w:tcPr>
           <w:p>
             <w:r>
-              <w:rPr>
-                <w:sz w:val="18"/>
-              </w:rPr>
-              <w:t>Cadastro de usuário administrativo.</w:t>
+              <w:t>Dashboard e acesso ao painel</w:t>
             </w:r>
           </w:p>
         </w:tc>
@@ -1603,40 +988,31 @@
         </w:trPr>
         <w:tc>
           <w:tcPr>
-            <w:tcW w:w="3264" w:type="dxa"/>
+            <w:tcW w:w="3360" w:type="dxa"/>
           </w:tcPr>
           <w:p>
             <w:r>
-              <w:rPr>
-                <w:sz w:val="18"/>
-              </w:rPr>
-              <w:t>/admin</w:t>
+              <w:t>/admin/upload</w:t>
             </w:r>
           </w:p>
         </w:tc>
         <w:tc>
           <w:tcPr>
-            <w:tcW w:w="3264" w:type="dxa"/>
+            <w:tcW w:w="3360" w:type="dxa"/>
           </w:tcPr>
           <w:p>
             <w:r>
-              <w:rPr>
-                <w:sz w:val="18"/>
-              </w:rPr>
-              <w:t>Web</w:t>
+              <w:t>POST</w:t>
             </w:r>
           </w:p>
         </w:tc>
         <w:tc>
           <w:tcPr>
-            <w:tcW w:w="3264" w:type="dxa"/>
+            <w:tcW w:w="3360" w:type="dxa"/>
           </w:tcPr>
           <w:p>
             <w:r>
-              <w:rPr>
-                <w:sz w:val="18"/>
-              </w:rPr>
-              <w:t>Dashboard principal do painel.</w:t>
+              <w:t>Upload de imagens e vídeos</w:t>
             </w:r>
           </w:p>
         </w:tc>
@@ -1647,40 +1023,31 @@
         </w:trPr>
         <w:tc>
           <w:tcPr>
-            <w:tcW w:w="3264" w:type="dxa"/>
+            <w:tcW w:w="3360" w:type="dxa"/>
           </w:tcPr>
           <w:p>
             <w:r>
-              <w:rPr>
-                <w:sz w:val="18"/>
-              </w:rPr>
-              <w:t>/admin/upload</w:t>
+              <w:t>/admin/playlist/add-existing</w:t>
             </w:r>
           </w:p>
         </w:tc>
         <w:tc>
           <w:tcPr>
-            <w:tcW w:w="3264" w:type="dxa"/>
+            <w:tcW w:w="3360" w:type="dxa"/>
           </w:tcPr>
           <w:p>
             <w:r>
-              <w:rPr>
-                <w:sz w:val="18"/>
-              </w:rPr>
               <w:t>POST</w:t>
             </w:r>
           </w:p>
         </w:tc>
         <w:tc>
           <w:tcPr>
-            <w:tcW w:w="3264" w:type="dxa"/>
+            <w:tcW w:w="3360" w:type="dxa"/>
           </w:tcPr>
           <w:p>
             <w:r>
-              <w:rPr>
-                <w:sz w:val="18"/>
-              </w:rPr>
-              <w:t>Envia imagem ou vídeo para a biblioteca e, opcionalmente, para a playlist.</w:t>
+              <w:t>Adição de mídia existente à playlist</w:t>
             </w:r>
           </w:p>
         </w:tc>
@@ -1691,40 +1058,31 @@
         </w:trPr>
         <w:tc>
           <w:tcPr>
-            <w:tcW w:w="3264" w:type="dxa"/>
+            <w:tcW w:w="3360" w:type="dxa"/>
           </w:tcPr>
           <w:p>
             <w:r>
-              <w:rPr>
-                <w:sz w:val="18"/>
-              </w:rPr>
-              <w:t>/admin/playlist/add-existing</w:t>
+              <w:t>/admin/item/&lt;id&gt;/update</w:t>
             </w:r>
           </w:p>
         </w:tc>
         <w:tc>
           <w:tcPr>
-            <w:tcW w:w="3264" w:type="dxa"/>
+            <w:tcW w:w="3360" w:type="dxa"/>
           </w:tcPr>
           <w:p>
             <w:r>
-              <w:rPr>
-                <w:sz w:val="18"/>
-              </w:rPr>
               <w:t>POST</w:t>
             </w:r>
           </w:p>
         </w:tc>
         <w:tc>
           <w:tcPr>
-            <w:tcW w:w="3264" w:type="dxa"/>
+            <w:tcW w:w="3360" w:type="dxa"/>
           </w:tcPr>
           <w:p>
             <w:r>
-              <w:rPr>
-                <w:sz w:val="18"/>
-              </w:rPr>
-              <w:t>Adiciona uma mídia já enviada à playlist.</w:t>
+              <w:t>Atualização de ordem e duração</w:t>
             </w:r>
           </w:p>
         </w:tc>
@@ -1735,40 +1093,31 @@
         </w:trPr>
         <w:tc>
           <w:tcPr>
-            <w:tcW w:w="3264" w:type="dxa"/>
+            <w:tcW w:w="3360" w:type="dxa"/>
           </w:tcPr>
           <w:p>
             <w:r>
-              <w:rPr>
-                <w:sz w:val="18"/>
-              </w:rPr>
-              <w:t>/admin/item/&lt;id&gt;/update</w:t>
+              <w:t>/admin/item/&lt;id&gt;/delete</w:t>
             </w:r>
           </w:p>
         </w:tc>
         <w:tc>
           <w:tcPr>
-            <w:tcW w:w="3264" w:type="dxa"/>
+            <w:tcW w:w="3360" w:type="dxa"/>
           </w:tcPr>
           <w:p>
             <w:r>
-              <w:rPr>
-                <w:sz w:val="18"/>
-              </w:rPr>
               <w:t>POST</w:t>
             </w:r>
           </w:p>
         </w:tc>
         <w:tc>
           <w:tcPr>
-            <w:tcW w:w="3264" w:type="dxa"/>
+            <w:tcW w:w="3360" w:type="dxa"/>
           </w:tcPr>
           <w:p>
             <w:r>
-              <w:rPr>
-                <w:sz w:val="18"/>
-              </w:rPr>
-              <w:t>Atualiza ordem e duração de um item da playlist.</w:t>
+              <w:t>Remoção de item da playlist</w:t>
             </w:r>
           </w:p>
         </w:tc>
@@ -1779,40 +1128,31 @@
         </w:trPr>
         <w:tc>
           <w:tcPr>
-            <w:tcW w:w="3264" w:type="dxa"/>
+            <w:tcW w:w="3360" w:type="dxa"/>
           </w:tcPr>
           <w:p>
             <w:r>
-              <w:rPr>
-                <w:sz w:val="18"/>
-              </w:rPr>
-              <w:t>/admin/item/&lt;id&gt;/delete</w:t>
+              <w:t>/admin/midia/&lt;id&gt;/delete</w:t>
             </w:r>
           </w:p>
         </w:tc>
         <w:tc>
           <w:tcPr>
-            <w:tcW w:w="3264" w:type="dxa"/>
+            <w:tcW w:w="3360" w:type="dxa"/>
           </w:tcPr>
           <w:p>
             <w:r>
-              <w:rPr>
-                <w:sz w:val="18"/>
-              </w:rPr>
               <w:t>POST</w:t>
             </w:r>
           </w:p>
         </w:tc>
         <w:tc>
           <w:tcPr>
-            <w:tcW w:w="3264" w:type="dxa"/>
+            <w:tcW w:w="3360" w:type="dxa"/>
           </w:tcPr>
           <w:p>
             <w:r>
-              <w:rPr>
-                <w:sz w:val="18"/>
-              </w:rPr>
-              <w:t>Remove item da playlist.</w:t>
+              <w:t>Remoção de mídia</w:t>
             </w:r>
           </w:p>
         </w:tc>
@@ -1823,40 +1163,31 @@
         </w:trPr>
         <w:tc>
           <w:tcPr>
-            <w:tcW w:w="3264" w:type="dxa"/>
+            <w:tcW w:w="3360" w:type="dxa"/>
           </w:tcPr>
           <w:p>
             <w:r>
-              <w:rPr>
-                <w:sz w:val="18"/>
-              </w:rPr>
-              <w:t>/admin/midia/&lt;id&gt;/delete</w:t>
+              <w:t>/admin/publish</w:t>
             </w:r>
           </w:p>
         </w:tc>
         <w:tc>
           <w:tcPr>
-            <w:tcW w:w="3264" w:type="dxa"/>
+            <w:tcW w:w="3360" w:type="dxa"/>
           </w:tcPr>
           <w:p>
             <w:r>
-              <w:rPr>
-                <w:sz w:val="18"/>
-              </w:rPr>
               <w:t>POST</w:t>
             </w:r>
           </w:p>
         </w:tc>
         <w:tc>
           <w:tcPr>
-            <w:tcW w:w="3264" w:type="dxa"/>
+            <w:tcW w:w="3360" w:type="dxa"/>
           </w:tcPr>
           <w:p>
             <w:r>
-              <w:rPr>
-                <w:sz w:val="18"/>
-              </w:rPr>
-              <w:t>Remove mídia da biblioteca e da playlist.</w:t>
+              <w:t>Registro de publicação</w:t>
             </w:r>
           </w:p>
         </w:tc>
@@ -1867,40 +1198,31 @@
         </w:trPr>
         <w:tc>
           <w:tcPr>
-            <w:tcW w:w="3264" w:type="dxa"/>
+            <w:tcW w:w="3360" w:type="dxa"/>
           </w:tcPr>
           <w:p>
             <w:r>
-              <w:rPr>
-                <w:sz w:val="18"/>
-              </w:rPr>
-              <w:t>/admin/publish</w:t>
+              <w:t>/player/&lt;codigo&gt;</w:t>
             </w:r>
           </w:p>
         </w:tc>
         <w:tc>
           <w:tcPr>
-            <w:tcW w:w="3264" w:type="dxa"/>
+            <w:tcW w:w="3360" w:type="dxa"/>
           </w:tcPr>
           <w:p>
             <w:r>
-              <w:rPr>
-                <w:sz w:val="18"/>
-              </w:rPr>
-              <w:t>POST</w:t>
+              <w:t>GET</w:t>
             </w:r>
           </w:p>
         </w:tc>
         <w:tc>
           <w:tcPr>
-            <w:tcW w:w="3264" w:type="dxa"/>
+            <w:tcW w:w="3360" w:type="dxa"/>
           </w:tcPr>
           <w:p>
             <w:r>
-              <w:rPr>
-                <w:sz w:val="18"/>
-              </w:rPr>
-              <w:t>Registra publicação e avisa que o player atualizará automaticamente.</w:t>
+              <w:t>Exibição do player web</w:t>
             </w:r>
           </w:p>
         </w:tc>
@@ -1911,128 +1233,31 @@
         </w:trPr>
         <w:tc>
           <w:tcPr>
-            <w:tcW w:w="3264" w:type="dxa"/>
+            <w:tcW w:w="3360" w:type="dxa"/>
           </w:tcPr>
           <w:p>
             <w:r>
-              <w:rPr>
-                <w:sz w:val="18"/>
-              </w:rPr>
-              <w:t>/player/&lt;codigo&gt;</w:t>
-            </w:r>
-          </w:p>
-        </w:tc>
-        <w:tc>
-          <w:tcPr>
-            <w:tcW w:w="3264" w:type="dxa"/>
-          </w:tcPr>
-          <w:p>
-            <w:r>
-              <w:rPr>
-                <w:sz w:val="18"/>
-              </w:rPr>
-              <w:t>Web</w:t>
-            </w:r>
-          </w:p>
-        </w:tc>
-        <w:tc>
-          <w:tcPr>
-            <w:tcW w:w="3264" w:type="dxa"/>
-          </w:tcPr>
-          <w:p>
-            <w:r>
-              <w:rPr>
-                <w:sz w:val="18"/>
-              </w:rPr>
-              <w:t>Página de exibição de uma tela específica.</w:t>
-            </w:r>
-          </w:p>
-        </w:tc>
-      </w:tr>
-      <w:tr>
-        <w:trPr>
-          <w:jc w:val="center"/>
-        </w:trPr>
-        <w:tc>
-          <w:tcPr>
-            <w:tcW w:w="3264" w:type="dxa"/>
-          </w:tcPr>
-          <w:p>
-            <w:r>
-              <w:rPr>
-                <w:sz w:val="18"/>
-              </w:rPr>
               <w:t>/api/player/&lt;codigo&gt;</w:t>
             </w:r>
           </w:p>
         </w:tc>
         <w:tc>
           <w:tcPr>
-            <w:tcW w:w="3264" w:type="dxa"/>
+            <w:tcW w:w="3360" w:type="dxa"/>
           </w:tcPr>
           <w:p>
             <w:r>
-              <w:rPr>
-                <w:sz w:val="18"/>
-              </w:rPr>
-              <w:t>API JSON</w:t>
+              <w:t>GET</w:t>
             </w:r>
           </w:p>
         </w:tc>
         <w:tc>
           <w:tcPr>
-            <w:tcW w:w="3264" w:type="dxa"/>
+            <w:tcW w:w="3360" w:type="dxa"/>
           </w:tcPr>
           <w:p>
             <w:r>
-              <w:rPr>
-                <w:sz w:val="18"/>
-              </w:rPr>
-              <w:t>Retorna status da tela e lista de slides.</w:t>
-            </w:r>
-          </w:p>
-        </w:tc>
-      </w:tr>
-      <w:tr>
-        <w:trPr>
-          <w:jc w:val="center"/>
-        </w:trPr>
-        <w:tc>
-          <w:tcPr>
-            <w:tcW w:w="3264" w:type="dxa"/>
-          </w:tcPr>
-          <w:p>
-            <w:r>
-              <w:rPr>
-                <w:sz w:val="18"/>
-              </w:rPr>
-              <w:t>/media/&lt;arquivo&gt;</w:t>
-            </w:r>
-          </w:p>
-        </w:tc>
-        <w:tc>
-          <w:tcPr>
-            <w:tcW w:w="3264" w:type="dxa"/>
-          </w:tcPr>
-          <w:p>
-            <w:r>
-              <w:rPr>
-                <w:sz w:val="18"/>
-              </w:rPr>
-              <w:t>Arquivo</w:t>
-            </w:r>
-          </w:p>
-        </w:tc>
-        <w:tc>
-          <w:tcPr>
-            <w:tcW w:w="3264" w:type="dxa"/>
-          </w:tcPr>
-          <w:p>
-            <w:r>
-              <w:rPr>
-                <w:sz w:val="18"/>
-              </w:rPr>
-              <w:t>Entrega imagens e vídeos para o player.</w:t>
+              <w:t>API consumida pelo player</w:t>
             </w:r>
           </w:p>
         </w:tc>
@@ -2043,93 +1268,41 @@
         <w:pStyle w:val="Ttulo1"/>
       </w:pPr>
       <w:r>
-        <w:lastRenderedPageBreak/>
         <w:t>7. Funcionamento do Player Android</w:t>
       </w:r>
     </w:p>
     <w:p>
-      <w:pPr>
-        <w:jc w:val="both"/>
-      </w:pPr>
       <w:r>
-        <w:t>O player Android foi implementado em Flutter e usa WebView para carregar a página /player/&lt;codigo&gt; do servidor. O app força orientação horizontal, oculta barras do sistema com modo imersivo e recarrega periodicamente para manter a exibição estável.</w:t>
+        <w:t>O player Android foi implementado em Flutter e utiliza WebView para carregar o player web do servidor Flask. O aplicativo funciona como terminal de exibição para TVs e monitores conectados, mantendo a tela em modo imersivo e orientação horizontal.</w:t>
       </w:r>
     </w:p>
     <w:p>
-      <w:pPr>
-        <w:jc w:val="both"/>
-      </w:pPr>
       <w:r>
-        <w:t>No código atual, o endereço do servidor fica definido na constante url do arquivo main.dart. Em instalação local, esse endereço pode apontar para o IP do computador servidor na rede. Quando o projeto estiver disponível em domínio institucional, esse endereço deverá ser substituído pelo domínio final do sistema, mantendo o caminho do player correspondente à tela cadastrada.</w:t>
+        <w:t>Na versão atual documentada, o player busca automaticamente o servidor Flask disponível na rede local. Assim, a implantação não depende de instruções de configuração manual de IP fixo no README. O requisito principal é que o dispositivo Android esteja na mesma rede local do computador ou servidor onde o Flask está em execução.</w:t>
       </w:r>
     </w:p>
     <w:p>
-      <w:pPr>
-        <w:pStyle w:val="Commarcadores"/>
-        <w:jc w:val="both"/>
-      </w:pPr>
       <w:r>
-        <w:t>O app não armazena a playlist localmente; ele carrega o player web do servidor.</w:t>
+        <w:t>Após localizar o servidor, o player carrega a interface de exibição, consulta a API periodicamente e atualiza a tela quando a playlist publicada é alterada. O app não deve ser apresentado como dependente de endereço fixo no material de documentação.</w:t>
       </w:r>
     </w:p>
     <w:p>
       <w:pPr>
-        <w:pStyle w:val="Commarcadores"/>
-        <w:jc w:val="both"/>
+        <w:pStyle w:val="Ttulo1"/>
       </w:pPr>
       <w:r>
-        <w:t>A troca de slides é controlada pelo JavaScript da página do player.</w:t>
-      </w:r>
-    </w:p>
-    <w:p>
-      <w:pPr>
-        <w:pStyle w:val="Commarcadores"/>
-        <w:jc w:val="both"/>
-      </w:pPr>
-      <w:r>
-        <w:t>Imagens e vídeos são ajustados com object-fit: contain para evitar corte e distorção.</w:t>
-      </w:r>
-    </w:p>
-    <w:p>
-      <w:pPr>
-        <w:pStyle w:val="Commarcadores"/>
-        <w:jc w:val="both"/>
-      </w:pPr>
-      <w:r>
-        <w:t>A barra inferior fica separada da área da mídia para não cobrir o conteúdo principal.</w:t>
-      </w:r>
-    </w:p>
-    <w:p>
-      <w:pPr>
-        <w:pStyle w:val="Commarcadores"/>
-        <w:jc w:val="both"/>
-      </w:pPr>
-      <w:r>
-        <w:t>O player consulta o servidor a cada 5 segundos para perceber alterações na playlist.</w:t>
-      </w:r>
-    </w:p>
-    <w:p>
-      <w:pPr>
-        <w:pStyle w:val="Ttulo1"/>
-      </w:pPr>
-      <w:r>
+        <w:lastRenderedPageBreak/>
         <w:t>8. Funcionamento do player web</w:t>
       </w:r>
     </w:p>
     <w:p>
-      <w:pPr>
-        <w:jc w:val="both"/>
-      </w:pPr>
       <w:r>
-        <w:t>A página templates/player.html monta a tela de exibição. O arquivo static/player.css define a tela em fundo azul escuro, área principal da mídia e barra inferior. O arquivo static/player.js busca a playlist na rota /api/player/&lt;codigo&gt;, compara se houve alteração, pré-carrega imagens e alterna os slides conforme a duração configurada no painel.</w:t>
+        <w:t>A página templates/player.html monta a tela de exibição. O arquivo static/player.css define o fundo, a área principal de mídia e a barra inferior. O arquivo static/player.js consulta a API do servidor, carrega imagens e vídeos, controla o tempo de cada item e verifica alterações automaticamente.</w:t>
       </w:r>
     </w:p>
     <w:p>
-      <w:pPr>
-        <w:jc w:val="both"/>
-      </w:pPr>
       <w:r>
-        <w:t>Quando não existe mídia publicada ou a playlist está vazia, a tela mostra a mensagem Aguardando conteúdo. Quando há imagens ou vídeos, cada item é exibido conforme sua duração. Para vídeos, a função onended avança para o próximo item quando o vídeo termina.</w:t>
+        <w:t>Quando não existe mídia publicada ou a playlist está vazia, a tela mostra mensagem de espera. Quando há imagens ou vídeos, cada item é exibido conforme sua duração configurada.</w:t>
       </w:r>
     </w:p>
     <w:p>
@@ -2141,9 +1314,13 @@
       </w:r>
     </w:p>
     <w:p>
+      <w:r>
+        <w:t>As funcionalidades abaixo correspondem ao escopo atual do MVP e devem ser apresentadas como recursos já existentes:</w:t>
+      </w:r>
+    </w:p>
+    <w:p>
       <w:pPr>
         <w:pStyle w:val="Commarcadores"/>
-        <w:jc w:val="both"/>
       </w:pPr>
       <w:r>
         <w:t>Login administrativo com senha armazenada em hash.</w:t>
@@ -2152,7 +1329,6 @@
     <w:p>
       <w:pPr>
         <w:pStyle w:val="Commarcadores"/>
-        <w:jc w:val="both"/>
       </w:pPr>
       <w:r>
         <w:t>Cadastro de novos usuários administrativos.</w:t>
@@ -2161,16 +1337,14 @@
     <w:p>
       <w:pPr>
         <w:pStyle w:val="Commarcadores"/>
-        <w:jc w:val="both"/>
       </w:pPr>
       <w:r>
-        <w:t>Dashboard com contagem de mídias, slides, telas e telas com último acesso registrado.</w:t>
+        <w:t>Dashboard simples com indicadores básicos.</w:t>
       </w:r>
     </w:p>
     <w:p>
       <w:pPr>
         <w:pStyle w:val="Commarcadores"/>
-        <w:jc w:val="both"/>
       </w:pPr>
       <w:r>
         <w:t>Upload de imagens e vídeos institucionais.</w:t>
@@ -2179,61 +1353,46 @@
     <w:p>
       <w:pPr>
         <w:pStyle w:val="Commarcadores"/>
-        <w:jc w:val="both"/>
       </w:pPr>
       <w:r>
-        <w:t>Biblioteca de mídias com remoção de arquivos.</w:t>
+        <w:t>Biblioteca de mídias cadastradas.</w:t>
       </w:r>
     </w:p>
     <w:p>
       <w:pPr>
         <w:pStyle w:val="Commarcadores"/>
-        <w:jc w:val="both"/>
       </w:pPr>
       <w:r>
-        <w:t>Playlist com limite configurado para 5 itens no MVP atual.</w:t>
+        <w:t>Remoção de mídias da biblioteca e da playlist.</w:t>
       </w:r>
     </w:p>
     <w:p>
       <w:pPr>
         <w:pStyle w:val="Commarcadores"/>
-        <w:jc w:val="both"/>
       </w:pPr>
       <w:r>
-        <w:t>Configuração de ordem e duração dos itens da playlist.</w:t>
+        <w:t>Playlist geral com ordem e duração configuráveis.</w:t>
       </w:r>
     </w:p>
     <w:p>
       <w:pPr>
         <w:pStyle w:val="Commarcadores"/>
-        <w:jc w:val="both"/>
       </w:pPr>
       <w:r>
-        <w:t>Publicação manual para registrar atualização da playlist.</w:t>
+        <w:t>Limite de 5 itens na playlist do MVP atual.</w:t>
       </w:r>
     </w:p>
     <w:p>
       <w:pPr>
         <w:pStyle w:val="Commarcadores"/>
-        <w:jc w:val="both"/>
       </w:pPr>
       <w:r>
-        <w:t>Cadastro inicial de telas/campi com códigos de player.</w:t>
+        <w:t>Publicação manual da playlist.</w:t>
       </w:r>
     </w:p>
     <w:p>
       <w:pPr>
         <w:pStyle w:val="Commarcadores"/>
-        <w:jc w:val="both"/>
-      </w:pPr>
-      <w:r>
-        <w:t>Ativação ou desativação de telas.</w:t>
-      </w:r>
-    </w:p>
-    <w:p>
-      <w:pPr>
-        <w:pStyle w:val="Commarcadores"/>
-        <w:jc w:val="both"/>
       </w:pPr>
       <w:r>
         <w:t>Player web responsivo para imagens e vídeos.</w:t>
@@ -2242,64 +1401,110 @@
     <w:p>
       <w:pPr>
         <w:pStyle w:val="Commarcadores"/>
-        <w:jc w:val="both"/>
       </w:pPr>
       <w:r>
-        <w:t>Player Android em tela cheia por WebView.</w:t>
+        <w:t>Player Android em tela cheia utilizando Flutter e WebView.</w:t>
       </w:r>
     </w:p>
     <w:p>
       <w:pPr>
-        <w:pStyle w:val="Ttulo1"/>
+        <w:pStyle w:val="Commarcadores"/>
       </w:pPr>
       <w:r>
-        <w:t>10. Limitações conhecidas do MVP</w:t>
+        <w:t>Busca automática do servidor Flask na rede local pelo player Android.</w:t>
       </w:r>
     </w:p>
     <w:p>
       <w:pPr>
         <w:pStyle w:val="Commarcadores"/>
-        <w:jc w:val="both"/>
       </w:pPr>
       <w:r>
-        <w:t>O banco SQLite é adequado para MVP e validação inicial, mas pode ser substituído futuramente por PostgreSQL ou outro banco centralizado.</w:t>
+        <w:t>Atualização automática do player após mudanças publicadas.</w:t>
       </w:r>
     </w:p>
     <w:p>
       <w:pPr>
         <w:pStyle w:val="Commarcadores"/>
-        <w:jc w:val="both"/>
       </w:pPr>
       <w:r>
-        <w:lastRenderedPageBreak/>
-        <w:t>A playlist atual é geral para todas as telas. Em versões futuras, cada campus ou tela poderá ter sua própria grade de conteúdos.</w:t>
+        <w:t>Registro básico de acesso dos players ao servidor.</w:t>
       </w:r>
     </w:p>
     <w:p>
       <w:pPr>
-        <w:pStyle w:val="Commarcadores"/>
-        <w:jc w:val="both"/>
+        <w:pStyle w:val="Ttulo1"/>
       </w:pPr>
       <w:r>
-        <w:t>O endereço do servidor no app Android precisa ser ajustado conforme o IP ou domínio final.</w:t>
+        <w:t>10. Funcionalidades ainda não disponíveis no MVP atual</w:t>
       </w:r>
     </w:p>
     <w:p>
-      <w:pPr>
-        <w:pStyle w:val="Commarcadores"/>
-        <w:jc w:val="both"/>
-      </w:pPr>
       <w:r>
-        <w:t>O controle de permissões ainda é simples; versões futuras podem ter perfis de usuário por setor.</w:t>
+        <w:t>As funções abaixo não devem ser citadas como prontas. Elas devem aparecer apenas como próximas evoluções ou limitações conhecidas:</w:t>
       </w:r>
     </w:p>
     <w:p>
       <w:pPr>
         <w:pStyle w:val="Commarcadores"/>
-        <w:jc w:val="both"/>
       </w:pPr>
       <w:r>
-        <w:t>O módulo de agendamentos ainda pode evoluir para regras por data, horário e campus.</w:t>
+        <w:t>Agendamento de playlists por data e horário.</w:t>
+      </w:r>
+    </w:p>
+    <w:p>
+      <w:pPr>
+        <w:pStyle w:val="Commarcadores"/>
+      </w:pPr>
+      <w:r>
+        <w:t>Playlists diferentes por tela, setor ou campus.</w:t>
+      </w:r>
+    </w:p>
+    <w:p>
+      <w:pPr>
+        <w:pStyle w:val="Commarcadores"/>
+      </w:pPr>
+      <w:r>
+        <w:t>Associação individual completa de telas a playlists específicas.</w:t>
+      </w:r>
+    </w:p>
+    <w:p>
+      <w:pPr>
+        <w:pStyle w:val="Commarcadores"/>
+      </w:pPr>
+      <w:r>
+        <w:t>Relatórios analíticos completos.</w:t>
+      </w:r>
+    </w:p>
+    <w:p>
+      <w:pPr>
+        <w:pStyle w:val="Commarcadores"/>
+      </w:pPr>
+      <w:r>
+        <w:t>Dashboard avançado de monitoramento.</w:t>
+      </w:r>
+    </w:p>
+    <w:p>
+      <w:pPr>
+        <w:pStyle w:val="Commarcadores"/>
+      </w:pPr>
+      <w:r>
+        <w:t>QR Codes institucionais dinâmicos.</w:t>
+      </w:r>
+    </w:p>
+    <w:p>
+      <w:pPr>
+        <w:pStyle w:val="Commarcadores"/>
+      </w:pPr>
+      <w:r>
+        <w:t>Permissões administrativas por setor.</w:t>
+      </w:r>
+    </w:p>
+    <w:p>
+      <w:pPr>
+        <w:pStyle w:val="Commarcadores"/>
+      </w:pPr>
+      <w:r>
+        <w:t>Uso definitivo com domínio institucional e HTTPS.</w:t>
       </w:r>
     </w:p>
     <w:p>
@@ -2312,14 +1517,15 @@
     </w:p>
     <w:tbl>
       <w:tblPr>
+        <w:tblStyle w:val="Tabelacomgrade"/>
         <w:tblW w:w="0" w:type="auto"/>
         <w:jc w:val="center"/>
         <w:tblLook w:val="04A0" w:firstRow="1" w:lastRow="0" w:firstColumn="1" w:lastColumn="0" w:noHBand="0" w:noVBand="1"/>
       </w:tblPr>
       <w:tblGrid>
-        <w:gridCol w:w="3264"/>
-        <w:gridCol w:w="3264"/>
-        <w:gridCol w:w="3264"/>
+        <w:gridCol w:w="3360"/>
+        <w:gridCol w:w="3360"/>
+        <w:gridCol w:w="3360"/>
       </w:tblGrid>
       <w:tr>
         <w:trPr>
@@ -2327,45 +1533,33 @@
         </w:trPr>
         <w:tc>
           <w:tcPr>
-            <w:tcW w:w="3264" w:type="dxa"/>
-            <w:shd w:val="clear" w:color="auto" w:fill="B7D7EE"/>
+            <w:tcW w:w="3360" w:type="dxa"/>
+            <w:shd w:val="clear" w:color="auto" w:fill="BBD7EE"/>
           </w:tcPr>
           <w:p>
             <w:r>
-              <w:rPr>
-                <w:b/>
-                <w:sz w:val="18"/>
-              </w:rPr>
               <w:t>MVP</w:t>
             </w:r>
           </w:p>
         </w:tc>
         <w:tc>
           <w:tcPr>
-            <w:tcW w:w="3264" w:type="dxa"/>
-            <w:shd w:val="clear" w:color="auto" w:fill="B7D7EE"/>
+            <w:tcW w:w="3360" w:type="dxa"/>
+            <w:shd w:val="clear" w:color="auto" w:fill="BBD7EE"/>
           </w:tcPr>
           <w:p>
             <w:r>
-              <w:rPr>
-                <w:b/>
-                <w:sz w:val="18"/>
-              </w:rPr>
               <w:t>Entregas principais</w:t>
             </w:r>
           </w:p>
         </w:tc>
         <w:tc>
           <w:tcPr>
-            <w:tcW w:w="3264" w:type="dxa"/>
-            <w:shd w:val="clear" w:color="auto" w:fill="B7D7EE"/>
+            <w:tcW w:w="3360" w:type="dxa"/>
+            <w:shd w:val="clear" w:color="auto" w:fill="BBD7EE"/>
           </w:tcPr>
           <w:p>
             <w:r>
-              <w:rPr>
-                <w:b/>
-                <w:sz w:val="18"/>
-              </w:rPr>
               <w:t>Resultado esperado</w:t>
             </w:r>
           </w:p>
@@ -2377,39 +1571,30 @@
         </w:trPr>
         <w:tc>
           <w:tcPr>
-            <w:tcW w:w="3264" w:type="dxa"/>
+            <w:tcW w:w="3360" w:type="dxa"/>
           </w:tcPr>
           <w:p>
             <w:r>
-              <w:rPr>
-                <w:sz w:val="18"/>
-              </w:rPr>
               <w:t>MVP 2 - Playlists por tela</w:t>
             </w:r>
           </w:p>
         </w:tc>
         <w:tc>
           <w:tcPr>
-            <w:tcW w:w="3264" w:type="dxa"/>
+            <w:tcW w:w="3360" w:type="dxa"/>
           </w:tcPr>
           <w:p>
             <w:r>
-              <w:rPr>
-                <w:sz w:val="18"/>
-              </w:rPr>
               <w:t>Criar playlists por campus, prédio ou ponto de exibição.</w:t>
             </w:r>
           </w:p>
         </w:tc>
         <w:tc>
           <w:tcPr>
-            <w:tcW w:w="3264" w:type="dxa"/>
+            <w:tcW w:w="3360" w:type="dxa"/>
           </w:tcPr>
           <w:p>
             <w:r>
-              <w:rPr>
-                <w:sz w:val="18"/>
-              </w:rPr>
               <w:t>Conteúdo segmentado por local.</w:t>
             </w:r>
           </w:p>
@@ -2421,40 +1606,40 @@
         </w:trPr>
         <w:tc>
           <w:tcPr>
-            <w:tcW w:w="3264" w:type="dxa"/>
+            <w:tcW w:w="3360" w:type="dxa"/>
           </w:tcPr>
           <w:p>
             <w:r>
-              <w:rPr>
-                <w:sz w:val="18"/>
-              </w:rPr>
               <w:t>MVP 3 - Agendamento</w:t>
             </w:r>
           </w:p>
         </w:tc>
         <w:tc>
           <w:tcPr>
-            <w:tcW w:w="3264" w:type="dxa"/>
+            <w:tcW w:w="3360" w:type="dxa"/>
           </w:tcPr>
           <w:p>
             <w:r>
-              <w:rPr>
-                <w:sz w:val="18"/>
-              </w:rPr>
-              <w:t>Publicar mídias por data, hora, período acadêmico e prioridade.</w:t>
+              <w:t xml:space="preserve">Publicar mídias por data, hora, </w:t>
+            </w:r>
+            <w:r>
+              <w:lastRenderedPageBreak/>
+              <w:t>período acadêmico e prioridade.</w:t>
             </w:r>
           </w:p>
         </w:tc>
         <w:tc>
           <w:tcPr>
-            <w:tcW w:w="3264" w:type="dxa"/>
+            <w:tcW w:w="3360" w:type="dxa"/>
           </w:tcPr>
           <w:p>
             <w:r>
-              <w:rPr>
-                <w:sz w:val="18"/>
-              </w:rPr>
-              <w:t>Comunicação mais precisa e automatizada.</w:t>
+              <w:lastRenderedPageBreak/>
+              <w:t xml:space="preserve">Comunicação mais precisa e </w:t>
+            </w:r>
+            <w:r>
+              <w:lastRenderedPageBreak/>
+              <w:t>automatizada.</w:t>
             </w:r>
           </w:p>
         </w:tc>
@@ -2465,40 +1650,32 @@
         </w:trPr>
         <w:tc>
           <w:tcPr>
-            <w:tcW w:w="3264" w:type="dxa"/>
+            <w:tcW w:w="3360" w:type="dxa"/>
           </w:tcPr>
           <w:p>
             <w:r>
-              <w:rPr>
-                <w:sz w:val="18"/>
-              </w:rPr>
-              <w:t>MVP 4 - Domínio institucional</w:t>
+              <w:lastRenderedPageBreak/>
+              <w:t>MVP 4 - Relatórios e QR Codes</w:t>
             </w:r>
           </w:p>
         </w:tc>
         <w:tc>
           <w:tcPr>
-            <w:tcW w:w="3264" w:type="dxa"/>
+            <w:tcW w:w="3360" w:type="dxa"/>
           </w:tcPr>
           <w:p>
             <w:r>
-              <w:rPr>
-                <w:sz w:val="18"/>
-              </w:rPr>
-              <w:t>Configurar acesso por domínio, HTTPS e URL fixa no app.</w:t>
+              <w:t>Adicionar relatórios completos e QR Codes institucionais.</w:t>
             </w:r>
           </w:p>
         </w:tc>
         <w:tc>
           <w:tcPr>
-            <w:tcW w:w="3264" w:type="dxa"/>
+            <w:tcW w:w="3360" w:type="dxa"/>
           </w:tcPr>
           <w:p>
             <w:r>
-              <w:rPr>
-                <w:sz w:val="18"/>
-              </w:rPr>
-              <w:t>Uso mais simples e estável nos players.</w:t>
+              <w:t>Maior acompanhamento e interação.</w:t>
             </w:r>
           </w:p>
         </w:tc>
@@ -2509,128 +1686,31 @@
         </w:trPr>
         <w:tc>
           <w:tcPr>
-            <w:tcW w:w="3264" w:type="dxa"/>
+            <w:tcW w:w="3360" w:type="dxa"/>
           </w:tcPr>
           <w:p>
             <w:r>
-              <w:rPr>
-                <w:sz w:val="18"/>
-              </w:rPr>
-              <w:t>MVP 5 - Relatórios</w:t>
+              <w:t>MVP 5 - Domínio institucional</w:t>
             </w:r>
           </w:p>
         </w:tc>
         <w:tc>
           <w:tcPr>
-            <w:tcW w:w="3264" w:type="dxa"/>
+            <w:tcW w:w="3360" w:type="dxa"/>
           </w:tcPr>
           <w:p>
             <w:r>
-              <w:rPr>
-                <w:sz w:val="18"/>
-              </w:rPr>
-              <w:t>Registrar acessos, status das telas e histórico de publicações.</w:t>
+              <w:t>Configurar acesso por domínio e HTTPS.</w:t>
             </w:r>
           </w:p>
         </w:tc>
         <w:tc>
           <w:tcPr>
-            <w:tcW w:w="3264" w:type="dxa"/>
+            <w:tcW w:w="3360" w:type="dxa"/>
           </w:tcPr>
           <w:p>
             <w:r>
-              <w:rPr>
-                <w:sz w:val="18"/>
-              </w:rPr>
-              <w:t>Monitoramento operacional.</w:t>
-            </w:r>
-          </w:p>
-        </w:tc>
-      </w:tr>
-      <w:tr>
-        <w:trPr>
-          <w:jc w:val="center"/>
-        </w:trPr>
-        <w:tc>
-          <w:tcPr>
-            <w:tcW w:w="3264" w:type="dxa"/>
-          </w:tcPr>
-          <w:p>
-            <w:r>
-              <w:rPr>
-                <w:sz w:val="18"/>
-              </w:rPr>
-              <w:t>MVP 6 - QR Codes e integração institucional</w:t>
-            </w:r>
-          </w:p>
-        </w:tc>
-        <w:tc>
-          <w:tcPr>
-            <w:tcW w:w="3264" w:type="dxa"/>
-          </w:tcPr>
-          <w:p>
-            <w:r>
-              <w:rPr>
-                <w:sz w:val="18"/>
-              </w:rPr>
-              <w:t>Associar QR Codes a editais, formulários, Ouvidoria e serviços acadêmicos.</w:t>
-            </w:r>
-          </w:p>
-        </w:tc>
-        <w:tc>
-          <w:tcPr>
-            <w:tcW w:w="3264" w:type="dxa"/>
-          </w:tcPr>
-          <w:p>
-            <w:r>
-              <w:rPr>
-                <w:sz w:val="18"/>
-              </w:rPr>
-              <w:t>Mais interação e rastreabilidade.</w:t>
-            </w:r>
-          </w:p>
-        </w:tc>
-      </w:tr>
-      <w:tr>
-        <w:trPr>
-          <w:jc w:val="center"/>
-        </w:trPr>
-        <w:tc>
-          <w:tcPr>
-            <w:tcW w:w="3264" w:type="dxa"/>
-          </w:tcPr>
-          <w:p>
-            <w:r>
-              <w:rPr>
-                <w:sz w:val="18"/>
-              </w:rPr>
-              <w:t>MVP 7 - Totens e interatividade</w:t>
-            </w:r>
-          </w:p>
-        </w:tc>
-        <w:tc>
-          <w:tcPr>
-            <w:tcW w:w="3264" w:type="dxa"/>
-          </w:tcPr>
-          <w:p>
-            <w:r>
-              <w:rPr>
-                <w:sz w:val="18"/>
-              </w:rPr>
-              <w:t>Adicionar suporte a telas touch e navegação por categorias.</w:t>
-            </w:r>
-          </w:p>
-        </w:tc>
-        <w:tc>
-          <w:tcPr>
-            <w:tcW w:w="3264" w:type="dxa"/>
-          </w:tcPr>
-          <w:p>
-            <w:r>
-              <w:rPr>
-                <w:sz w:val="18"/>
-              </w:rPr>
-              <w:t>Consulta ativa de informações pelos estudantes.</w:t>
+              <w:t>Uso mais estável em ambiente institucional.</w:t>
             </w:r>
           </w:p>
         </w:tc>
@@ -2646,25 +1726,15 @@
     </w:p>
     <w:p>
       <w:pPr>
-        <w:jc w:val="both"/>
+        <w:pStyle w:val="Numerada"/>
       </w:pPr>
       <w:r>
-        <w:t>Os passos abaixo consideram instalação direta no Windows, utilizando Python instalado no próprio sistema.</w:t>
+        <w:t>Instale o Python 3.10 ou superior.</w:t>
       </w:r>
     </w:p>
     <w:p>
       <w:pPr>
         <w:pStyle w:val="Numerada"/>
-        <w:jc w:val="both"/>
-      </w:pPr>
-      <w:r>
-        <w:t>Instale o Python 3.10 ou superior pelo site oficial e marque a opção Add Python to PATH durante a instalação.</w:t>
-      </w:r>
-    </w:p>
-    <w:p>
-      <w:pPr>
-        <w:pStyle w:val="Numerada"/>
-        <w:jc w:val="both"/>
       </w:pPr>
       <w:r>
         <w:t>Abra o PowerShell ou Prompt de Comando na pasta do projeto.</w:t>
@@ -2673,7 +1743,6 @@
     <w:p>
       <w:pPr>
         <w:pStyle w:val="Numerada"/>
-        <w:jc w:val="both"/>
       </w:pPr>
       <w:r>
         <w:t>Entre na pasta servidor_flask.</w:t>
@@ -2682,16 +1751,14 @@
     <w:p>
       <w:pPr>
         <w:pStyle w:val="Numerada"/>
-        <w:jc w:val="both"/>
       </w:pPr>
       <w:r>
-        <w:t>Crie um ambiente virtual com: python -m venv venv</w:t>
+        <w:t>Crie o ambiente virtual com: python -m venv venv</w:t>
       </w:r>
     </w:p>
     <w:p>
       <w:pPr>
         <w:pStyle w:val="Numerada"/>
-        <w:jc w:val="both"/>
       </w:pPr>
       <w:r>
         <w:t>Ative o ambiente virtual com: venv\Scripts\activate</w:t>
@@ -2700,7 +1767,6 @@
     <w:p>
       <w:pPr>
         <w:pStyle w:val="Numerada"/>
-        <w:jc w:val="both"/>
       </w:pPr>
       <w:r>
         <w:t>Instale as dependências com: pip install -r requirements.txt</w:t>
@@ -2709,7 +1775,6 @@
     <w:p>
       <w:pPr>
         <w:pStyle w:val="Numerada"/>
-        <w:jc w:val="both"/>
       </w:pPr>
       <w:r>
         <w:t>Inicie o servidor com: python app.py</w:t>
@@ -2718,7 +1783,6 @@
     <w:p>
       <w:pPr>
         <w:pStyle w:val="Numerada"/>
-        <w:jc w:val="both"/>
       </w:pPr>
       <w:r>
         <w:t>Acesse o painel pelo navegador no endereço informado pelo terminal, usando /login.</w:t>
@@ -2726,15 +1790,6 @@
     </w:p>
     <w:p>
       <w:pPr>
-        <w:pStyle w:val="Numerada"/>
-        <w:jc w:val="both"/>
-      </w:pPr>
-      <w:r>
-        <w:t>No primeiro acesso, use o usuário admin e a senha admin123, depois crie ou ajuste o usuário administrativo.</w:t>
-      </w:r>
-    </w:p>
-    <w:p>
-      <w:pPr>
         <w:pStyle w:val="Ttulo1"/>
       </w:pPr>
       <w:r>
@@ -2743,16 +1798,7 @@
     </w:p>
     <w:p>
       <w:pPr>
-        <w:jc w:val="both"/>
-      </w:pPr>
-      <w:r>
-        <w:t>Os passos abaixo consideram instalação direta em uma distribuição Linux comum, sem uso de WSL.</w:t>
-      </w:r>
-    </w:p>
-    <w:p>
-      <w:pPr>
         <w:pStyle w:val="Numerada"/>
-        <w:jc w:val="both"/>
       </w:pPr>
       <w:r>
         <w:t>Instale Python 3, pip e venv pelo gerenciador de pacotes da distribuição.</w:t>
@@ -2761,17 +1807,14 @@
     <w:p>
       <w:pPr>
         <w:pStyle w:val="Numerada"/>
-        <w:jc w:val="both"/>
       </w:pPr>
       <w:r>
-        <w:lastRenderedPageBreak/>
         <w:t>Abra o terminal na pasta do projeto.</w:t>
       </w:r>
     </w:p>
     <w:p>
       <w:pPr>
         <w:pStyle w:val="Numerada"/>
-        <w:jc w:val="both"/>
       </w:pPr>
       <w:r>
         <w:t>Entre na pasta servidor_flask.</w:t>
@@ -2780,7 +1823,6 @@
     <w:p>
       <w:pPr>
         <w:pStyle w:val="Numerada"/>
-        <w:jc w:val="both"/>
       </w:pPr>
       <w:r>
         <w:t>Crie o ambiente virtual com: python3 -m venv venv</w:t>
@@ -2789,7 +1831,6 @@
     <w:p>
       <w:pPr>
         <w:pStyle w:val="Numerada"/>
-        <w:jc w:val="both"/>
       </w:pPr>
       <w:r>
         <w:t>Ative o ambiente virtual com: source venv/bin/activate</w:t>
@@ -2798,7 +1839,6 @@
     <w:p>
       <w:pPr>
         <w:pStyle w:val="Numerada"/>
-        <w:jc w:val="both"/>
       </w:pPr>
       <w:r>
         <w:t>Instale as dependências com: pip install -r requirements.txt</w:t>
@@ -2807,7 +1847,6 @@
     <w:p>
       <w:pPr>
         <w:pStyle w:val="Numerada"/>
-        <w:jc w:val="both"/>
       </w:pPr>
       <w:r>
         <w:t>Inicie o servidor com: python3 app.py</w:t>
@@ -2816,7 +1855,6 @@
     <w:p>
       <w:pPr>
         <w:pStyle w:val="Numerada"/>
-        <w:jc w:val="both"/>
       </w:pPr>
       <w:r>
         <w:t>Acesse o painel pelo navegador no endereço informado pelo terminal, usando /login.</w:t>
@@ -2824,66 +1862,23 @@
     </w:p>
     <w:p>
       <w:pPr>
-        <w:pStyle w:val="Numerada"/>
-        <w:jc w:val="both"/>
+        <w:pStyle w:val="Ttulo1"/>
       </w:pPr>
       <w:r>
-        <w:t>No primeiro acesso, use o usuário admin e a senha admin123, depois crie ou ajuste o usuário administrativo.</w:t>
+        <w:t>14. Manual de uso do sistema</w:t>
       </w:r>
     </w:p>
     <w:p>
       <w:pPr>
-        <w:pStyle w:val="Ttulo1"/>
+        <w:pStyle w:val="Ttulo2"/>
       </w:pPr>
       <w:r>
-        <w:t>14. Configuração do aplicativo Android</w:t>
+        <w:t>14.1 Acesso ao painel</w:t>
       </w:r>
     </w:p>
     <w:p>
       <w:pPr>
-        <w:jc w:val="both"/>
-      </w:pPr>
-      <w:r>
-        <w:t>Para o player Android apontar para o servidor correto, abra o arquivo main.dart e atualize a constante url. Em rede local, use o IP do computador servidor. Em implantação institucional com domínio, use o domínio final.</w:t>
-      </w:r>
-    </w:p>
-    <w:p>
-      <w:r>
-        <w:rPr>
-          <w:rFonts w:ascii="Courier New" w:hAnsi="Courier New"/>
-          <w:sz w:val="18"/>
-        </w:rPr>
-        <w:t>static const String url = 'http://ENDERECO_DO_SERVIDOR:5000/player/conecta_campus';</w:t>
-      </w:r>
-    </w:p>
-    <w:p>
-      <w:pPr>
-        <w:jc w:val="both"/>
-      </w:pPr>
-      <w:r>
-        <w:t>O código depois de /player/ deve corresponder ao código da tela cadastrada no banco. O pacote atual já cria telas iniciais para diferentes campi, como conecta_campus, antonio_giovanni e josefina_demes.</w:t>
-      </w:r>
-    </w:p>
-    <w:p>
-      <w:pPr>
-        <w:pStyle w:val="Ttulo1"/>
-      </w:pPr>
-      <w:r>
-        <w:t>15. Manual de uso do sistema</w:t>
-      </w:r>
-    </w:p>
-    <w:p>
-      <w:pPr>
-        <w:pStyle w:val="Ttulo2"/>
-      </w:pPr>
-      <w:r>
-        <w:t>15.1 Acesso ao painel</w:t>
-      </w:r>
-    </w:p>
-    <w:p>
-      <w:pPr>
         <w:pStyle w:val="Numerada"/>
-        <w:jc w:val="both"/>
       </w:pPr>
       <w:r>
         <w:t>Abra o navegador no computador administrativo.</w:t>
@@ -2892,7 +1887,6 @@
     <w:p>
       <w:pPr>
         <w:pStyle w:val="Numerada"/>
-        <w:jc w:val="both"/>
       </w:pPr>
       <w:r>
         <w:t>Acesse o endereço do servidor seguido de /login.</w:t>
@@ -2901,7 +1895,6 @@
     <w:p>
       <w:pPr>
         <w:pStyle w:val="Numerada"/>
-        <w:jc w:val="both"/>
       </w:pPr>
       <w:r>
         <w:t>Entre com o usuário administrativo.</w:t>
@@ -2910,7 +1903,6 @@
     <w:p>
       <w:pPr>
         <w:pStyle w:val="Numerada"/>
-        <w:jc w:val="both"/>
       </w:pPr>
       <w:r>
         <w:t>Após o login, o painel exibirá os atalhos e indicadores do sistema.</w:t>
@@ -2921,13 +1913,12 @@
         <w:pStyle w:val="Ttulo2"/>
       </w:pPr>
       <w:r>
-        <w:t>15.2 Envio de mídias</w:t>
+        <w:t>14.2 Envio de mídias</w:t>
       </w:r>
     </w:p>
     <w:p>
       <w:pPr>
         <w:pStyle w:val="Numerada"/>
-        <w:jc w:val="both"/>
       </w:pPr>
       <w:r>
         <w:t>Acesse a área de mídias ou upload.</w:t>
@@ -2936,7 +1927,6 @@
     <w:p>
       <w:pPr>
         <w:pStyle w:val="Numerada"/>
-        <w:jc w:val="both"/>
       </w:pPr>
       <w:r>
         <w:t>Selecione uma imagem ou vídeo institucional.</w:t>
@@ -2945,7 +1935,6 @@
     <w:p>
       <w:pPr>
         <w:pStyle w:val="Numerada"/>
-        <w:jc w:val="both"/>
       </w:pPr>
       <w:r>
         <w:t>Defina a duração do item quando for imagem.</w:t>
@@ -2954,7 +1943,6 @@
     <w:p>
       <w:pPr>
         <w:pStyle w:val="Numerada"/>
-        <w:jc w:val="both"/>
       </w:pPr>
       <w:r>
         <w:t>Marque a opção para adicionar à playlist, quando necessário.</w:t>
@@ -2963,16 +1951,12 @@
     <w:p>
       <w:pPr>
         <w:pStyle w:val="Numerada"/>
-        <w:jc w:val="both"/>
       </w:pPr>
       <w:r>
         <w:t>Confirme o envio.</w:t>
       </w:r>
     </w:p>
     <w:p>
-      <w:pPr>
-        <w:jc w:val="both"/>
-      </w:pPr>
       <w:r>
         <w:t>Formatos aceitos no MVP atual: png, jpg, jpeg, gif, webp, mp4 e webm. O limite configurado para upload é de até 200 MB por arquivo.</w:t>
       </w:r>
@@ -2982,13 +1966,12 @@
         <w:pStyle w:val="Ttulo2"/>
       </w:pPr>
       <w:r>
-        <w:t>15.3 Organização da playlist</w:t>
+        <w:t>14.3 Organização da playlist</w:t>
       </w:r>
     </w:p>
     <w:p>
       <w:pPr>
         <w:pStyle w:val="Numerada"/>
-        <w:jc w:val="both"/>
       </w:pPr>
       <w:r>
         <w:t>Acesse a área de playlists.</w:t>
@@ -2997,16 +1980,15 @@
     <w:p>
       <w:pPr>
         <w:pStyle w:val="Numerada"/>
-        <w:jc w:val="both"/>
       </w:pPr>
       <w:r>
+        <w:lastRenderedPageBreak/>
         <w:t>Adicione mídias já enviadas ou remova itens existentes.</w:t>
       </w:r>
     </w:p>
     <w:p>
       <w:pPr>
         <w:pStyle w:val="Numerada"/>
-        <w:jc w:val="both"/>
       </w:pPr>
       <w:r>
         <w:t>Ajuste a ordem de exibição.</w:t>
@@ -3015,7 +1997,6 @@
     <w:p>
       <w:pPr>
         <w:pStyle w:val="Numerada"/>
-        <w:jc w:val="both"/>
       </w:pPr>
       <w:r>
         <w:t>Ajuste a duração de cada item.</w:t>
@@ -3024,7 +2005,6 @@
     <w:p>
       <w:pPr>
         <w:pStyle w:val="Numerada"/>
-        <w:jc w:val="both"/>
       </w:pPr>
       <w:r>
         <w:t>Publique a playlist para registrar a atualização.</w:t>
@@ -3032,25 +2012,15 @@
     </w:p>
     <w:p>
       <w:pPr>
-        <w:jc w:val="both"/>
+        <w:pStyle w:val="Ttulo2"/>
       </w:pPr>
       <w:r>
-        <w:t>O player verifica alterações automaticamente e atualiza a exibição em poucos segundos, desde que esteja conectado ao servidor.</w:t>
+        <w:t>14.4 Uso das telas</w:t>
       </w:r>
     </w:p>
     <w:p>
       <w:pPr>
-        <w:pStyle w:val="Ttulo2"/>
-      </w:pPr>
-      <w:r>
-        <w:lastRenderedPageBreak/>
-        <w:t>15.4 Uso das telas</w:t>
-      </w:r>
-    </w:p>
-    <w:p>
-      <w:pPr>
         <w:pStyle w:val="Numerada"/>
-        <w:jc w:val="both"/>
       </w:pPr>
       <w:r>
         <w:t>Conecte a TV Box ou computador reaproveitado ao monitor ou televisão.</w:t>
@@ -3059,34 +2029,38 @@
     <w:p>
       <w:pPr>
         <w:pStyle w:val="Numerada"/>
-        <w:jc w:val="both"/>
       </w:pPr>
       <w:r>
-        <w:t>Garanta que o dispositivo esteja na mesma rede do servidor ou tenha acesso ao domínio configurado.</w:t>
+        <w:t>Garanta que o dispositivo esteja na mesma rede local do servidor Flask.</w:t>
       </w:r>
     </w:p>
     <w:p>
       <w:pPr>
         <w:pStyle w:val="Numerada"/>
-        <w:jc w:val="both"/>
       </w:pPr>
       <w:r>
-        <w:t>Abra o aplicativo Android ou o navegador no endereço /player/&lt;codigo&gt;.</w:t>
+        <w:t>Abra o aplicativo Android do Conecta Campus.</w:t>
       </w:r>
     </w:p>
     <w:p>
       <w:pPr>
         <w:pStyle w:val="Numerada"/>
-        <w:jc w:val="both"/>
       </w:pPr>
       <w:r>
-        <w:t>Verifique se a tela aparece como acessada no painel administrativo.</w:t>
+        <w:t>Aguarde a busca automática do servidor na rede local.</w:t>
       </w:r>
     </w:p>
     <w:p>
       <w:pPr>
         <w:pStyle w:val="Numerada"/>
-        <w:jc w:val="both"/>
+      </w:pPr>
+      <w:r>
+        <w:t>Após a conexão, o player carregará a playlist publicada e exibirá os conteúdos automaticamente.</w:t>
+      </w:r>
+    </w:p>
+    <w:p>
+      <w:pPr>
+        <w:pStyle w:val="Numerada"/>
       </w:pPr>
       <w:r>
         <w:t>Mantenha o equipamento ligado durante o período de funcionamento do campus.</w:t>
@@ -3097,1139 +2071,23 @@
         <w:pStyle w:val="Ttulo1"/>
       </w:pPr>
       <w:r>
-        <w:t>16. Sustentabilidade e impacto institucional</w:t>
-      </w:r>
-    </w:p>
-    <w:p>
-      <w:pPr>
-        <w:jc w:val="both"/>
-      </w:pPr>
-      <w:r>
-        <w:t>O Conecta Campus contribui para a sustentabilidade ao reaproveitar TV Boxes Android, computadores antigos e monitores já disponíveis. Essa estratégia reduz custos de aquisição, prolonga a vida útil dos equipamentos e diminui o descarte de lixo eletrônico. Além do impacto ambiental, a solução melhora o acesso à informação acadêmica, reduz impressões e aumenta a eficiência da comunicação institucional.</w:t>
-      </w:r>
-    </w:p>
-    <w:p>
-      <w:pPr>
-        <w:pStyle w:val="Ttulo1"/>
-      </w:pPr>
-      <w:r>
-        <w:t>17. Segurança e boas práticas</w:t>
-      </w:r>
-    </w:p>
-    <w:p>
-      <w:pPr>
-        <w:pStyle w:val="Commarcadores"/>
-        <w:jc w:val="both"/>
-      </w:pPr>
-      <w:r>
-        <w:t>Alterar a senha padrão após a primeira instalação.</w:t>
-      </w:r>
-    </w:p>
-    <w:p>
-      <w:pPr>
-        <w:pStyle w:val="Commarcadores"/>
-        <w:jc w:val="both"/>
-      </w:pPr>
-      <w:r>
-        <w:t>Usar senhas fortes para usuários administrativos.</w:t>
-      </w:r>
-    </w:p>
-    <w:p>
-      <w:pPr>
-        <w:pStyle w:val="Commarcadores"/>
-        <w:jc w:val="both"/>
-      </w:pPr>
-      <w:r>
-        <w:t>Permitir upload apenas de formatos necessários.</w:t>
-      </w:r>
-    </w:p>
-    <w:p>
-      <w:pPr>
-        <w:pStyle w:val="Commarcadores"/>
-        <w:jc w:val="both"/>
-      </w:pPr>
-      <w:r>
-        <w:t>Manter cópia de segurança da pasta media e do arquivo painel.db.</w:t>
-      </w:r>
-    </w:p>
-    <w:p>
-      <w:pPr>
-        <w:pStyle w:val="Commarcadores"/>
-        <w:jc w:val="both"/>
-      </w:pPr>
-      <w:r>
-        <w:t>Usar domínio e HTTPS quando o sistema for disponibilizado institucionalmente.</w:t>
-      </w:r>
-    </w:p>
-    <w:p>
-      <w:pPr>
-        <w:pStyle w:val="Commarcadores"/>
-        <w:jc w:val="both"/>
-      </w:pPr>
-      <w:r>
-        <w:t>Manter o dispositivo player em modo tela cheia e com energia estável.</w:t>
-      </w:r>
-    </w:p>
-    <w:p>
-      <w:pPr>
-        <w:pStyle w:val="Ttulo1"/>
-      </w:pPr>
-      <w:r>
-        <w:t>18. README GitHub</w:t>
+        <w:t>15. Sustentabilidade e impacto institucional</w:t>
       </w:r>
     </w:p>
     <w:p>
       <w:r>
-        <w:rPr>
-          <w:rFonts w:ascii="Courier New" w:hAnsi="Courier New"/>
-          <w:sz w:val="16"/>
-        </w:rPr>
-        <w:t># Conecta Campus</w:t>
-      </w:r>
-      <w:r>
-        <w:rPr>
-          <w:rFonts w:ascii="Courier New" w:hAnsi="Courier New"/>
-          <w:sz w:val="16"/>
-        </w:rPr>
-        <w:br/>
-      </w:r>
-      <w:r>
-        <w:rPr>
-          <w:rFonts w:ascii="Courier New" w:hAnsi="Courier New"/>
-          <w:sz w:val="16"/>
-        </w:rPr>
-        <w:br/>
-        <w:t>Plataforma de Digital Signage para comunicação institucional universitária, criada para exibir editais, avisos, eventos, comunicados e mídias em telas espalhadas pelo campus.</w:t>
-      </w:r>
-      <w:r>
-        <w:rPr>
-          <w:rFonts w:ascii="Courier New" w:hAnsi="Courier New"/>
-          <w:sz w:val="16"/>
-        </w:rPr>
-        <w:br/>
-      </w:r>
-      <w:r>
-        <w:rPr>
-          <w:rFonts w:ascii="Courier New" w:hAnsi="Courier New"/>
-          <w:sz w:val="16"/>
-        </w:rPr>
-        <w:br/>
-        <w:t>## Objetivo</w:t>
-      </w:r>
-      <w:r>
-        <w:rPr>
-          <w:rFonts w:ascii="Courier New" w:hAnsi="Courier New"/>
-          <w:sz w:val="16"/>
-        </w:rPr>
-        <w:br/>
-      </w:r>
-      <w:r>
-        <w:rPr>
-          <w:rFonts w:ascii="Courier New" w:hAnsi="Courier New"/>
-          <w:sz w:val="16"/>
-        </w:rPr>
-        <w:br/>
-        <w:t>Centralizar a publicação de informações acadêmicas em um painel web e distribuí-las automaticamente para players instalados em TV Boxes Android, computadores reaproveitados ou outros dispositivos conectados a monitores.</w:t>
-      </w:r>
-      <w:r>
-        <w:rPr>
-          <w:rFonts w:ascii="Courier New" w:hAnsi="Courier New"/>
-          <w:sz w:val="16"/>
-        </w:rPr>
-        <w:br/>
-      </w:r>
-      <w:r>
-        <w:rPr>
-          <w:rFonts w:ascii="Courier New" w:hAnsi="Courier New"/>
-          <w:sz w:val="16"/>
-        </w:rPr>
-        <w:br/>
-        <w:t>## Principais recursos</w:t>
-      </w:r>
-      <w:r>
-        <w:rPr>
-          <w:rFonts w:ascii="Courier New" w:hAnsi="Courier New"/>
-          <w:sz w:val="16"/>
-        </w:rPr>
-        <w:br/>
-      </w:r>
-      <w:r>
-        <w:rPr>
-          <w:rFonts w:ascii="Courier New" w:hAnsi="Courier New"/>
-          <w:sz w:val="16"/>
-        </w:rPr>
-        <w:br/>
-        <w:t>- Painel administrativo com login.</w:t>
-      </w:r>
-      <w:r>
-        <w:rPr>
-          <w:rFonts w:ascii="Courier New" w:hAnsi="Courier New"/>
-          <w:sz w:val="16"/>
-        </w:rPr>
-        <w:br/>
-        <w:t>- Cadastro de usuários administrativos.</w:t>
-      </w:r>
-      <w:r>
-        <w:rPr>
-          <w:rFonts w:ascii="Courier New" w:hAnsi="Courier New"/>
-          <w:sz w:val="16"/>
-        </w:rPr>
-        <w:br/>
-        <w:t>- Upload de imagens e vídeos.</w:t>
-      </w:r>
-      <w:r>
-        <w:rPr>
-          <w:rFonts w:ascii="Courier New" w:hAnsi="Courier New"/>
-          <w:sz w:val="16"/>
-        </w:rPr>
-        <w:br/>
-        <w:t>- Biblioteca de mídias.</w:t>
-      </w:r>
-      <w:r>
-        <w:rPr>
-          <w:rFonts w:ascii="Courier New" w:hAnsi="Courier New"/>
-          <w:sz w:val="16"/>
-        </w:rPr>
-        <w:br/>
-        <w:t>- Playlist com ordem e duração dos conteúdos.</w:t>
-      </w:r>
-      <w:r>
-        <w:rPr>
-          <w:rFonts w:ascii="Courier New" w:hAnsi="Courier New"/>
-          <w:sz w:val="16"/>
-        </w:rPr>
-        <w:br/>
-        <w:t>- Publicação de playlist.</w:t>
-      </w:r>
-      <w:r>
-        <w:rPr>
-          <w:rFonts w:ascii="Courier New" w:hAnsi="Courier New"/>
-          <w:sz w:val="16"/>
-        </w:rPr>
-        <w:br/>
-        <w:t>- Cadastro e controle de telas.</w:t>
-      </w:r>
-      <w:r>
-        <w:rPr>
-          <w:rFonts w:ascii="Courier New" w:hAnsi="Courier New"/>
-          <w:sz w:val="16"/>
-        </w:rPr>
-        <w:br/>
-        <w:t>- Player web responsivo.</w:t>
-      </w:r>
-      <w:r>
-        <w:rPr>
-          <w:rFonts w:ascii="Courier New" w:hAnsi="Courier New"/>
-          <w:sz w:val="16"/>
-        </w:rPr>
-        <w:br/>
-        <w:t>- Aplicativo Android em Flutter com WebView.</w:t>
-      </w:r>
-      <w:r>
-        <w:rPr>
-          <w:rFonts w:ascii="Courier New" w:hAnsi="Courier New"/>
-          <w:sz w:val="16"/>
-        </w:rPr>
-        <w:br/>
-        <w:t>- Atualização automática da playlist no player.</w:t>
-      </w:r>
-      <w:r>
-        <w:rPr>
-          <w:rFonts w:ascii="Courier New" w:hAnsi="Courier New"/>
-          <w:sz w:val="16"/>
-        </w:rPr>
-        <w:br/>
-      </w:r>
-      <w:r>
-        <w:rPr>
-          <w:rFonts w:ascii="Courier New" w:hAnsi="Courier New"/>
-          <w:sz w:val="16"/>
-        </w:rPr>
-        <w:br/>
-        <w:t>## Tecnologias</w:t>
-      </w:r>
-      <w:r>
-        <w:rPr>
-          <w:rFonts w:ascii="Courier New" w:hAnsi="Courier New"/>
-          <w:sz w:val="16"/>
-        </w:rPr>
-        <w:br/>
-      </w:r>
-      <w:r>
-        <w:rPr>
-          <w:rFonts w:ascii="Courier New" w:hAnsi="Courier New"/>
-          <w:sz w:val="16"/>
-        </w:rPr>
-        <w:br/>
-        <w:t>- Python</w:t>
-      </w:r>
-      <w:r>
-        <w:rPr>
-          <w:rFonts w:ascii="Courier New" w:hAnsi="Courier New"/>
-          <w:sz w:val="16"/>
-        </w:rPr>
-        <w:br/>
-        <w:t>- Flask</w:t>
-      </w:r>
-      <w:r>
-        <w:rPr>
-          <w:rFonts w:ascii="Courier New" w:hAnsi="Courier New"/>
-          <w:sz w:val="16"/>
-        </w:rPr>
-        <w:br/>
-      </w:r>
-      <w:r>
-        <w:rPr>
-          <w:rFonts w:ascii="Courier New" w:hAnsi="Courier New"/>
-          <w:sz w:val="16"/>
-        </w:rPr>
-        <w:lastRenderedPageBreak/>
-        <w:t>- SQLite</w:t>
-      </w:r>
-      <w:r>
-        <w:rPr>
-          <w:rFonts w:ascii="Courier New" w:hAnsi="Courier New"/>
-          <w:sz w:val="16"/>
-        </w:rPr>
-        <w:br/>
-        <w:t>- HTML, CSS e JavaScript</w:t>
-      </w:r>
-      <w:r>
-        <w:rPr>
-          <w:rFonts w:ascii="Courier New" w:hAnsi="Courier New"/>
-          <w:sz w:val="16"/>
-        </w:rPr>
-        <w:br/>
-        <w:t>- Flutter</w:t>
-      </w:r>
-      <w:r>
-        <w:rPr>
-          <w:rFonts w:ascii="Courier New" w:hAnsi="Courier New"/>
-          <w:sz w:val="16"/>
-        </w:rPr>
-        <w:br/>
-        <w:t>- webview_flutter</w:t>
-      </w:r>
-      <w:r>
-        <w:rPr>
-          <w:rFonts w:ascii="Courier New" w:hAnsi="Courier New"/>
-          <w:sz w:val="16"/>
-        </w:rPr>
-        <w:br/>
-      </w:r>
-      <w:r>
-        <w:rPr>
-          <w:rFonts w:ascii="Courier New" w:hAnsi="Courier New"/>
-          <w:sz w:val="16"/>
-        </w:rPr>
-        <w:br/>
-        <w:t>## Estrutura</w:t>
-      </w:r>
-      <w:r>
-        <w:rPr>
-          <w:rFonts w:ascii="Courier New" w:hAnsi="Courier New"/>
-          <w:sz w:val="16"/>
-        </w:rPr>
-        <w:br/>
-      </w:r>
-      <w:r>
-        <w:rPr>
-          <w:rFonts w:ascii="Courier New" w:hAnsi="Courier New"/>
-          <w:sz w:val="16"/>
-        </w:rPr>
-        <w:br/>
-        <w:t>```text</w:t>
-      </w:r>
-      <w:r>
-        <w:rPr>
-          <w:rFonts w:ascii="Courier New" w:hAnsi="Courier New"/>
-          <w:sz w:val="16"/>
-        </w:rPr>
-        <w:br/>
-        <w:t>ProjetoConectaCampus/</w:t>
-      </w:r>
-      <w:r>
-        <w:rPr>
-          <w:rFonts w:ascii="Courier New" w:hAnsi="Courier New"/>
-          <w:sz w:val="16"/>
-        </w:rPr>
-        <w:br/>
-        <w:t>├── servidor_flask/</w:t>
-      </w:r>
-      <w:r>
-        <w:rPr>
-          <w:rFonts w:ascii="Courier New" w:hAnsi="Courier New"/>
-          <w:sz w:val="16"/>
-        </w:rPr>
-        <w:br/>
-        <w:t>│   ├── app.py</w:t>
-      </w:r>
-      <w:r>
-        <w:rPr>
-          <w:rFonts w:ascii="Courier New" w:hAnsi="Courier New"/>
-          <w:sz w:val="16"/>
-        </w:rPr>
-        <w:br/>
-        <w:t>│   ├── wsgi.py</w:t>
-      </w:r>
-      <w:r>
-        <w:rPr>
-          <w:rFonts w:ascii="Courier New" w:hAnsi="Courier New"/>
-          <w:sz w:val="16"/>
-        </w:rPr>
-        <w:br/>
-        <w:t>│   ├── requirements.txt</w:t>
-      </w:r>
-      <w:r>
-        <w:rPr>
-          <w:rFonts w:ascii="Courier New" w:hAnsi="Courier New"/>
-          <w:sz w:val="16"/>
-        </w:rPr>
-        <w:br/>
-        <w:t>│   ├── static/</w:t>
-      </w:r>
-      <w:r>
-        <w:rPr>
-          <w:rFonts w:ascii="Courier New" w:hAnsi="Courier New"/>
-          <w:sz w:val="16"/>
-        </w:rPr>
-        <w:br/>
-        <w:t>│   ├── templates/</w:t>
-      </w:r>
-      <w:r>
-        <w:rPr>
-          <w:rFonts w:ascii="Courier New" w:hAnsi="Courier New"/>
-          <w:sz w:val="16"/>
-        </w:rPr>
-        <w:br/>
-        <w:t>│   └── media/</w:t>
-      </w:r>
-      <w:r>
-        <w:rPr>
-          <w:rFonts w:ascii="Courier New" w:hAnsi="Courier New"/>
-          <w:sz w:val="16"/>
-        </w:rPr>
-        <w:br/>
-        <w:t>└── android_player_builder/</w:t>
-      </w:r>
-      <w:r>
-        <w:rPr>
-          <w:rFonts w:ascii="Courier New" w:hAnsi="Courier New"/>
-          <w:sz w:val="16"/>
-        </w:rPr>
-        <w:br/>
-        <w:t xml:space="preserve">    ├── main.dart</w:t>
-      </w:r>
-      <w:r>
-        <w:rPr>
-          <w:rFonts w:ascii="Courier New" w:hAnsi="Courier New"/>
-          <w:sz w:val="16"/>
-        </w:rPr>
-        <w:br/>
-        <w:t xml:space="preserve">    └── conecta_campus_player_ok/</w:t>
-      </w:r>
-      <w:r>
-        <w:rPr>
-          <w:rFonts w:ascii="Courier New" w:hAnsi="Courier New"/>
-          <w:sz w:val="16"/>
-        </w:rPr>
-        <w:br/>
-        <w:t>```</w:t>
-      </w:r>
-      <w:r>
-        <w:rPr>
-          <w:rFonts w:ascii="Courier New" w:hAnsi="Courier New"/>
-          <w:sz w:val="16"/>
-        </w:rPr>
-        <w:br/>
-      </w:r>
-      <w:r>
-        <w:rPr>
-          <w:rFonts w:ascii="Courier New" w:hAnsi="Courier New"/>
-          <w:sz w:val="16"/>
-        </w:rPr>
-        <w:br/>
-        <w:t>## Instalação no Windows</w:t>
-      </w:r>
-      <w:r>
-        <w:rPr>
-          <w:rFonts w:ascii="Courier New" w:hAnsi="Courier New"/>
-          <w:sz w:val="16"/>
-        </w:rPr>
-        <w:br/>
-      </w:r>
-      <w:r>
-        <w:rPr>
-          <w:rFonts w:ascii="Courier New" w:hAnsi="Courier New"/>
-          <w:sz w:val="16"/>
-        </w:rPr>
-        <w:br/>
-        <w:t>```powershell</w:t>
-      </w:r>
-      <w:r>
-        <w:rPr>
-          <w:rFonts w:ascii="Courier New" w:hAnsi="Courier New"/>
-          <w:sz w:val="16"/>
-        </w:rPr>
-        <w:br/>
-        <w:t>cd servidor_flask</w:t>
-      </w:r>
-      <w:r>
-        <w:rPr>
-          <w:rFonts w:ascii="Courier New" w:hAnsi="Courier New"/>
-          <w:sz w:val="16"/>
-        </w:rPr>
-        <w:br/>
-        <w:t>python -m venv venv</w:t>
-      </w:r>
-      <w:r>
-        <w:rPr>
-          <w:rFonts w:ascii="Courier New" w:hAnsi="Courier New"/>
-          <w:sz w:val="16"/>
-        </w:rPr>
-        <w:br/>
-        <w:t>venv\Scripts\activate</w:t>
-      </w:r>
-      <w:r>
-        <w:rPr>
-          <w:rFonts w:ascii="Courier New" w:hAnsi="Courier New"/>
-          <w:sz w:val="16"/>
-        </w:rPr>
-        <w:br/>
-        <w:t>pip install -r requirements.txt</w:t>
-      </w:r>
-      <w:r>
-        <w:rPr>
-          <w:rFonts w:ascii="Courier New" w:hAnsi="Courier New"/>
-          <w:sz w:val="16"/>
-        </w:rPr>
-        <w:br/>
-        <w:t>python app.py</w:t>
-      </w:r>
-      <w:r>
-        <w:rPr>
-          <w:rFonts w:ascii="Courier New" w:hAnsi="Courier New"/>
-          <w:sz w:val="16"/>
-        </w:rPr>
-        <w:br/>
-        <w:t>```</w:t>
-      </w:r>
-      <w:r>
-        <w:rPr>
-          <w:rFonts w:ascii="Courier New" w:hAnsi="Courier New"/>
-          <w:sz w:val="16"/>
-        </w:rPr>
-        <w:br/>
-      </w:r>
-      <w:r>
-        <w:rPr>
-          <w:rFonts w:ascii="Courier New" w:hAnsi="Courier New"/>
-          <w:sz w:val="16"/>
-        </w:rPr>
-        <w:br/>
-        <w:t>Depois acesse o painel pelo navegador usando o endereço informado no terminal, seguido de `/login`.</w:t>
-      </w:r>
-      <w:r>
-        <w:rPr>
-          <w:rFonts w:ascii="Courier New" w:hAnsi="Courier New"/>
-          <w:sz w:val="16"/>
-        </w:rPr>
-        <w:br/>
-      </w:r>
-      <w:r>
-        <w:rPr>
-          <w:rFonts w:ascii="Courier New" w:hAnsi="Courier New"/>
-          <w:sz w:val="16"/>
-        </w:rPr>
-        <w:br/>
-        <w:t>## Instalação no Linux</w:t>
-      </w:r>
-      <w:r>
-        <w:rPr>
-          <w:rFonts w:ascii="Courier New" w:hAnsi="Courier New"/>
-          <w:sz w:val="16"/>
-        </w:rPr>
-        <w:br/>
-      </w:r>
-      <w:r>
-        <w:rPr>
-          <w:rFonts w:ascii="Courier New" w:hAnsi="Courier New"/>
-          <w:sz w:val="16"/>
-        </w:rPr>
-        <w:br/>
-        <w:t>```bash</w:t>
-      </w:r>
-      <w:r>
-        <w:rPr>
-          <w:rFonts w:ascii="Courier New" w:hAnsi="Courier New"/>
-          <w:sz w:val="16"/>
-        </w:rPr>
-        <w:br/>
-        <w:t>cd servidor_flask</w:t>
-      </w:r>
-      <w:r>
-        <w:rPr>
-          <w:rFonts w:ascii="Courier New" w:hAnsi="Courier New"/>
-          <w:sz w:val="16"/>
-        </w:rPr>
-        <w:br/>
-        <w:t>python3 -m venv venv</w:t>
-      </w:r>
-      <w:r>
-        <w:rPr>
-          <w:rFonts w:ascii="Courier New" w:hAnsi="Courier New"/>
-          <w:sz w:val="16"/>
-        </w:rPr>
-        <w:br/>
-        <w:t>source venv/bin/activate</w:t>
-      </w:r>
-      <w:r>
-        <w:rPr>
-          <w:rFonts w:ascii="Courier New" w:hAnsi="Courier New"/>
-          <w:sz w:val="16"/>
-        </w:rPr>
-        <w:br/>
-        <w:t>pip install -r requirements.txt</w:t>
-      </w:r>
-      <w:r>
-        <w:rPr>
-          <w:rFonts w:ascii="Courier New" w:hAnsi="Courier New"/>
-          <w:sz w:val="16"/>
-        </w:rPr>
-        <w:br/>
-        <w:t>python3 app.py</w:t>
-      </w:r>
-      <w:r>
-        <w:rPr>
-          <w:rFonts w:ascii="Courier New" w:hAnsi="Courier New"/>
-          <w:sz w:val="16"/>
-        </w:rPr>
-        <w:br/>
-        <w:t>```</w:t>
-      </w:r>
-      <w:r>
-        <w:rPr>
-          <w:rFonts w:ascii="Courier New" w:hAnsi="Courier New"/>
-          <w:sz w:val="16"/>
-        </w:rPr>
-        <w:br/>
-      </w:r>
-      <w:r>
-        <w:rPr>
-          <w:rFonts w:ascii="Courier New" w:hAnsi="Courier New"/>
-          <w:sz w:val="16"/>
-        </w:rPr>
-        <w:br/>
-        <w:t>Depois acesse o painel pelo navegador usando o endereço informado no terminal, seguido de `/login`.</w:t>
-      </w:r>
-      <w:r>
-        <w:rPr>
-          <w:rFonts w:ascii="Courier New" w:hAnsi="Courier New"/>
-          <w:sz w:val="16"/>
-        </w:rPr>
-        <w:br/>
-      </w:r>
-      <w:r>
-        <w:rPr>
-          <w:rFonts w:ascii="Courier New" w:hAnsi="Courier New"/>
-          <w:sz w:val="16"/>
-        </w:rPr>
-        <w:br/>
-        <w:t>## Primeiro acesso</w:t>
-      </w:r>
-      <w:r>
-        <w:rPr>
-          <w:rFonts w:ascii="Courier New" w:hAnsi="Courier New"/>
-          <w:sz w:val="16"/>
-        </w:rPr>
-        <w:br/>
-      </w:r>
-      <w:r>
-        <w:rPr>
-          <w:rFonts w:ascii="Courier New" w:hAnsi="Courier New"/>
-          <w:sz w:val="16"/>
-        </w:rPr>
-        <w:br/>
-        <w:t>Usuário inicial:</w:t>
-      </w:r>
-      <w:r>
-        <w:rPr>
-          <w:rFonts w:ascii="Courier New" w:hAnsi="Courier New"/>
-          <w:sz w:val="16"/>
-        </w:rPr>
-        <w:br/>
-      </w:r>
-      <w:r>
-        <w:rPr>
-          <w:rFonts w:ascii="Courier New" w:hAnsi="Courier New"/>
-          <w:sz w:val="16"/>
-        </w:rPr>
-        <w:br/>
-        <w:t>```text</w:t>
-      </w:r>
-      <w:r>
-        <w:rPr>
-          <w:rFonts w:ascii="Courier New" w:hAnsi="Courier New"/>
-          <w:sz w:val="16"/>
-        </w:rPr>
-        <w:br/>
-        <w:t>usuário: admin</w:t>
-      </w:r>
-      <w:r>
-        <w:rPr>
-          <w:rFonts w:ascii="Courier New" w:hAnsi="Courier New"/>
-          <w:sz w:val="16"/>
-        </w:rPr>
-        <w:br/>
-        <w:t>senha: admin123</w:t>
-      </w:r>
-      <w:r>
-        <w:rPr>
-          <w:rFonts w:ascii="Courier New" w:hAnsi="Courier New"/>
-          <w:sz w:val="16"/>
-        </w:rPr>
-        <w:br/>
-        <w:t>```</w:t>
-      </w:r>
-      <w:r>
-        <w:rPr>
-          <w:rFonts w:ascii="Courier New" w:hAnsi="Courier New"/>
-          <w:sz w:val="16"/>
-        </w:rPr>
-        <w:br/>
-      </w:r>
-      <w:r>
-        <w:rPr>
-          <w:rFonts w:ascii="Courier New" w:hAnsi="Courier New"/>
-          <w:sz w:val="16"/>
-        </w:rPr>
-        <w:br/>
-        <w:t>Após o primeiro acesso, recomenda-se criar um novo usuário administrativo e alterar as credenciais padrão.</w:t>
-      </w:r>
-      <w:r>
-        <w:rPr>
-          <w:rFonts w:ascii="Courier New" w:hAnsi="Courier New"/>
-          <w:sz w:val="16"/>
-        </w:rPr>
-        <w:br/>
-      </w:r>
-      <w:r>
-        <w:rPr>
-          <w:rFonts w:ascii="Courier New" w:hAnsi="Courier New"/>
-          <w:sz w:val="16"/>
-        </w:rPr>
-        <w:br/>
-        <w:t>## Player</w:t>
-      </w:r>
-      <w:r>
-        <w:rPr>
-          <w:rFonts w:ascii="Courier New" w:hAnsi="Courier New"/>
-          <w:sz w:val="16"/>
-        </w:rPr>
-        <w:br/>
-      </w:r>
-      <w:r>
-        <w:rPr>
-          <w:rFonts w:ascii="Courier New" w:hAnsi="Courier New"/>
-          <w:sz w:val="16"/>
-        </w:rPr>
-        <w:br/>
-        <w:t>O player pode ser acessado no navegador por:</w:t>
-      </w:r>
-      <w:r>
-        <w:rPr>
-          <w:rFonts w:ascii="Courier New" w:hAnsi="Courier New"/>
-          <w:sz w:val="16"/>
-        </w:rPr>
-        <w:br/>
-      </w:r>
-      <w:r>
-        <w:rPr>
-          <w:rFonts w:ascii="Courier New" w:hAnsi="Courier New"/>
-          <w:sz w:val="16"/>
-        </w:rPr>
-        <w:br/>
-        <w:t>```text</w:t>
-      </w:r>
-      <w:r>
-        <w:rPr>
-          <w:rFonts w:ascii="Courier New" w:hAnsi="Courier New"/>
-          <w:sz w:val="16"/>
-        </w:rPr>
-        <w:br/>
-        <w:t>/player/conecta_campus</w:t>
-      </w:r>
-      <w:r>
-        <w:rPr>
-          <w:rFonts w:ascii="Courier New" w:hAnsi="Courier New"/>
-          <w:sz w:val="16"/>
-        </w:rPr>
-        <w:br/>
-        <w:t>```</w:t>
-      </w:r>
-      <w:r>
-        <w:rPr>
-          <w:rFonts w:ascii="Courier New" w:hAnsi="Courier New"/>
-          <w:sz w:val="16"/>
-        </w:rPr>
-        <w:br/>
-      </w:r>
-      <w:r>
-        <w:rPr>
-          <w:rFonts w:ascii="Courier New" w:hAnsi="Courier New"/>
-          <w:sz w:val="16"/>
-        </w:rPr>
-        <w:br/>
-      </w:r>
-      <w:r>
-        <w:rPr>
-          <w:rFonts w:ascii="Courier New" w:hAnsi="Courier New"/>
-          <w:sz w:val="16"/>
-        </w:rPr>
-        <w:lastRenderedPageBreak/>
-        <w:t>O aplicativo Android carrega esse endereço dentro de uma WebView. Para usar outro servidor, atualize a constante `url` em `main.dart`.</w:t>
-      </w:r>
-      <w:r>
-        <w:rPr>
-          <w:rFonts w:ascii="Courier New" w:hAnsi="Courier New"/>
-          <w:sz w:val="16"/>
-        </w:rPr>
-        <w:br/>
-      </w:r>
-      <w:r>
-        <w:rPr>
-          <w:rFonts w:ascii="Courier New" w:hAnsi="Courier New"/>
-          <w:sz w:val="16"/>
-        </w:rPr>
-        <w:br/>
-        <w:t>Exemplo:</w:t>
-      </w:r>
-      <w:r>
-        <w:rPr>
-          <w:rFonts w:ascii="Courier New" w:hAnsi="Courier New"/>
-          <w:sz w:val="16"/>
-        </w:rPr>
-        <w:br/>
-      </w:r>
-      <w:r>
-        <w:rPr>
-          <w:rFonts w:ascii="Courier New" w:hAnsi="Courier New"/>
-          <w:sz w:val="16"/>
-        </w:rPr>
-        <w:br/>
-        <w:t>```dart</w:t>
-      </w:r>
-      <w:r>
-        <w:rPr>
-          <w:rFonts w:ascii="Courier New" w:hAnsi="Courier New"/>
-          <w:sz w:val="16"/>
-        </w:rPr>
-        <w:br/>
-        <w:t>static const String url = 'http://ENDERECO_DO_SERVIDOR:5000/player/conecta_campus';</w:t>
-      </w:r>
-      <w:r>
-        <w:rPr>
-          <w:rFonts w:ascii="Courier New" w:hAnsi="Courier New"/>
-          <w:sz w:val="16"/>
-        </w:rPr>
-        <w:br/>
-        <w:t>```</w:t>
-      </w:r>
-      <w:r>
-        <w:rPr>
-          <w:rFonts w:ascii="Courier New" w:hAnsi="Courier New"/>
-          <w:sz w:val="16"/>
-        </w:rPr>
-        <w:br/>
-      </w:r>
-      <w:r>
-        <w:rPr>
-          <w:rFonts w:ascii="Courier New" w:hAnsi="Courier New"/>
-          <w:sz w:val="16"/>
-        </w:rPr>
-        <w:br/>
-        <w:t>Quando houver domínio institucional, substitua o IP pelo domínio final.</w:t>
-      </w:r>
-      <w:r>
-        <w:rPr>
-          <w:rFonts w:ascii="Courier New" w:hAnsi="Courier New"/>
-          <w:sz w:val="16"/>
-        </w:rPr>
-        <w:br/>
-      </w:r>
-      <w:r>
-        <w:rPr>
-          <w:rFonts w:ascii="Courier New" w:hAnsi="Courier New"/>
-          <w:sz w:val="16"/>
-        </w:rPr>
-        <w:br/>
-        <w:t>## Funcionamento</w:t>
-      </w:r>
-      <w:r>
-        <w:rPr>
-          <w:rFonts w:ascii="Courier New" w:hAnsi="Courier New"/>
-          <w:sz w:val="16"/>
-        </w:rPr>
-        <w:br/>
-      </w:r>
-      <w:r>
-        <w:rPr>
-          <w:rFonts w:ascii="Courier New" w:hAnsi="Courier New"/>
-          <w:sz w:val="16"/>
-        </w:rPr>
-        <w:br/>
-        <w:t>1. O administrador acessa o painel.</w:t>
-      </w:r>
-      <w:r>
-        <w:rPr>
-          <w:rFonts w:ascii="Courier New" w:hAnsi="Courier New"/>
-          <w:sz w:val="16"/>
-        </w:rPr>
-        <w:br/>
-        <w:t>2. Envia imagens ou vídeos.</w:t>
-      </w:r>
-      <w:r>
-        <w:rPr>
-          <w:rFonts w:ascii="Courier New" w:hAnsi="Courier New"/>
-          <w:sz w:val="16"/>
-        </w:rPr>
-        <w:br/>
-        <w:t>3. Organiza a playlist.</w:t>
-      </w:r>
-      <w:r>
-        <w:rPr>
-          <w:rFonts w:ascii="Courier New" w:hAnsi="Courier New"/>
-          <w:sz w:val="16"/>
-        </w:rPr>
-        <w:br/>
-        <w:t>4. Publica as alterações.</w:t>
-      </w:r>
-      <w:r>
-        <w:rPr>
-          <w:rFonts w:ascii="Courier New" w:hAnsi="Courier New"/>
-          <w:sz w:val="16"/>
-        </w:rPr>
-        <w:br/>
-        <w:t>5. O player consulta a API do servidor.</w:t>
-      </w:r>
-      <w:r>
-        <w:rPr>
-          <w:rFonts w:ascii="Courier New" w:hAnsi="Courier New"/>
-          <w:sz w:val="16"/>
-        </w:rPr>
-        <w:br/>
-        <w:t>6. A tela exibe os conteúdos automaticamente.</w:t>
-      </w:r>
-      <w:r>
-        <w:rPr>
-          <w:rFonts w:ascii="Courier New" w:hAnsi="Courier New"/>
-          <w:sz w:val="16"/>
-        </w:rPr>
-        <w:br/>
-      </w:r>
-      <w:r>
-        <w:rPr>
-          <w:rFonts w:ascii="Courier New" w:hAnsi="Courier New"/>
-          <w:sz w:val="16"/>
-        </w:rPr>
-        <w:br/>
-        <w:t>## Sustentabilidade</w:t>
-      </w:r>
-      <w:r>
-        <w:rPr>
-          <w:rFonts w:ascii="Courier New" w:hAnsi="Courier New"/>
-          <w:sz w:val="16"/>
-        </w:rPr>
-        <w:br/>
-      </w:r>
-      <w:r>
-        <w:rPr>
-          <w:rFonts w:ascii="Courier New" w:hAnsi="Courier New"/>
-          <w:sz w:val="16"/>
-        </w:rPr>
-        <w:br/>
-        <w:t>O projeto incentiva o reaproveitamento de TV Boxes Android, computadores antigos e monitores disponíveis, reduzindo descarte eletrônico e custos de implantação.</w:t>
-      </w:r>
-      <w:r>
-        <w:rPr>
-          <w:rFonts w:ascii="Courier New" w:hAnsi="Courier New"/>
-          <w:sz w:val="16"/>
-        </w:rPr>
-        <w:br/>
-      </w:r>
-      <w:r>
-        <w:rPr>
-          <w:rFonts w:ascii="Courier New" w:hAnsi="Courier New"/>
-          <w:sz w:val="16"/>
-        </w:rPr>
-        <w:br/>
-        <w:t>## Próximas evoluções</w:t>
-      </w:r>
-      <w:r>
-        <w:rPr>
-          <w:rFonts w:ascii="Courier New" w:hAnsi="Courier New"/>
-          <w:sz w:val="16"/>
-        </w:rPr>
-        <w:br/>
-      </w:r>
-      <w:r>
-        <w:rPr>
-          <w:rFonts w:ascii="Courier New" w:hAnsi="Courier New"/>
-          <w:sz w:val="16"/>
-        </w:rPr>
-        <w:br/>
-        <w:t>- Playlists por tela ou campus.</w:t>
-      </w:r>
-      <w:r>
-        <w:rPr>
-          <w:rFonts w:ascii="Courier New" w:hAnsi="Courier New"/>
-          <w:sz w:val="16"/>
-        </w:rPr>
-        <w:br/>
-        <w:t>- Agendamento por data e horário.</w:t>
-      </w:r>
-      <w:r>
-        <w:rPr>
-          <w:rFonts w:ascii="Courier New" w:hAnsi="Courier New"/>
-          <w:sz w:val="16"/>
-        </w:rPr>
-        <w:br/>
-        <w:t>- Relatórios de status das telas.</w:t>
-      </w:r>
-      <w:r>
-        <w:rPr>
-          <w:rFonts w:ascii="Courier New" w:hAnsi="Courier New"/>
-          <w:sz w:val="16"/>
-        </w:rPr>
-        <w:br/>
-        <w:t>- Integração com QR Codes institucionais.</w:t>
-      </w:r>
-      <w:r>
-        <w:rPr>
-          <w:rFonts w:ascii="Courier New" w:hAnsi="Courier New"/>
-          <w:sz w:val="16"/>
-        </w:rPr>
-        <w:br/>
-        <w:t>- Painel com permissões por setor.</w:t>
-      </w:r>
-      <w:r>
-        <w:rPr>
-          <w:rFonts w:ascii="Courier New" w:hAnsi="Courier New"/>
-          <w:sz w:val="16"/>
-        </w:rPr>
-        <w:br/>
-        <w:t>- Uso com domínio e HTTPS.</w:t>
-      </w:r>
-      <w:r>
-        <w:rPr>
-          <w:rFonts w:ascii="Courier New" w:hAnsi="Courier New"/>
-          <w:sz w:val="16"/>
-        </w:rPr>
-        <w:br/>
+        <w:t>O Conecta Campus contribui para a sustentabilidade ao reaproveitar TV Boxes Android, computadores antigos e monitores já disponíveis. Essa estratégia reduz custos de aquisição, prolonga a vida útil dos equipamentos e diminui o descarte de lixo eletrônico.</w:t>
       </w:r>
     </w:p>
-    <w:p>
-      <w:pPr>
-        <w:pStyle w:val="Ttulo1"/>
-      </w:pPr>
-      <w:r>
-        <w:t xml:space="preserve">19. </w:t>
-      </w:r>
-    </w:p>
-    <w:p>
-      <w:pPr>
-        <w:jc w:val="both"/>
-      </w:pPr>
-      <w:r>
-        <w:t>A documentação consolida o estado atual do Conecta Campus como uma solução funcional de MVP para comunicação institucional digital. O sistema já possui servidor Flask, painel administrativo, armazenamento de mídias, API de player, player web e aplicativo Android em WebView. As próximas etapas devem priorizar domínio institucional, playlists segmentadas, agendamento, relatórios e melhoria gradual da segurança operacional.</w:t>
-      </w:r>
-    </w:p>
+    <w:p/>
     <w:sectPr>
-      <w:footerReference w:type="default" r:id="rId8"/>
       <w:pgSz w:w="12240" w:h="15840"/>
-      <w:pgMar w:top="1080" w:right="1224" w:bottom="1080" w:left="1224" w:header="720" w:footer="720" w:gutter="0"/>
+      <w:pgMar w:top="1008" w:right="1080" w:bottom="1008" w:left="1080" w:header="720" w:footer="720" w:gutter="0"/>
       <w:cols w:space="720"/>
       <w:docGrid w:linePitch="360"/>
     </w:sectPr>
   </w:body>
 </w:document>
-</file>
-
-<file path=word/endnotes.xml><?xml version="1.0" encoding="utf-8"?>
-<w:endnotes xmlns:wpc="http://schemas.microsoft.com/office/word/2010/wordprocessingCanvas" xmlns:cx="http://schemas.microsoft.com/office/drawing/2014/chartex" xmlns:cx1="http://schemas.microsoft.com/office/drawing/2015/9/8/chartex" xmlns:cx2="http://schemas.microsoft.com/office/drawing/2015/10/21/chartex" xmlns:cx3="http://schemas.microsoft.com/office/drawing/2016/5/9/chartex" xmlns:cx4="http://schemas.microsoft.com/office/drawing/2016/5/10/chartex" xmlns:cx5="http://schemas.microsoft.com/office/drawing/2016/5/11/chartex" xmlns:cx6="http://schemas.microsoft.com/office/drawing/2016/5/12/chartex" xmlns:cx7="http://schemas.microsoft.com/office/drawing/2016/5/13/chartex" xmlns:cx8="http://schemas.microsoft.com/office/drawing/2016/5/14/chartex" xmlns:mc="http://schemas.openxmlformats.org/markup-compatibility/2006" xmlns:aink="http://schemas.microsoft.com/office/drawing/2016/ink" xmlns:am3d="http://schemas.microsoft.com/office/drawing/2017/model3d" xmlns:o="urn:schemas-microsoft-com:office:office" xmlns:oel="http://schemas.microsoft.com/office/2019/extlst" xmlns:r="http://schemas.openxmlformats.org/officeDocument/2006/relationships" xmlns:m="http://schemas.openxmlformats.org/officeDocument/2006/math" xmlns:v="urn:schemas-microsoft-com:vml" xmlns:wp14="http://schemas.microsoft.com/office/word/2010/wordprocessingDrawing" xmlns:wp="http://schemas.openxmlformats.org/drawingml/2006/wordprocessingDrawing" xmlns:w10="urn:schemas-microsoft-com:office:word" xmlns:w="http://schemas.openxmlformats.org/wordprocessingml/2006/main" xmlns:w14="http://schemas.microsoft.com/office/word/2010/wordml" xmlns:w15="http://schemas.microsoft.com/office/word/2012/wordml" xmlns:w16cex="http://schemas.microsoft.com/office/word/2018/wordml/cex" xmlns:w16cid="http://schemas.microsoft.com/office/word/2016/wordml/cid" xmlns:w16="http://schemas.microsoft.com/office/word/2018/wordml" xmlns:w16du="http://schemas.microsoft.com/office/word/2023/wordml/word16du" xmlns:w16sdtdh="http://schemas.microsoft.com/office/word/2020/wordml/sdtdatahash" xmlns:w16sdtfl="http://schemas.microsoft.com/office/word/2024/wordml/sdtformatlock" xmlns:w16se="http://schemas.microsoft.com/office/word/2015/wordml/symex" xmlns:wpg="http://schemas.microsoft.com/office/word/2010/wordprocessingGroup" xmlns:wpi="http://schemas.microsoft.com/office/word/2010/wordprocessingInk" xmlns:wne="http://schemas.microsoft.com/office/word/2006/wordml" xmlns:wps="http://schemas.microsoft.com/office/word/2010/wordprocessingShape" mc:Ignorable="w14 w15 w16se w16cid w16 w16cex w16sdtdh w16sdtfl w16du wp14">
-  <w:endnote w:type="separator" w:id="-1">
-    <w:p>
-      <w:pPr>
-        <w:spacing w:after="0" w:line="240" w:lineRule="auto"/>
-      </w:pPr>
-      <w:r>
-        <w:separator/>
-      </w:r>
-    </w:p>
-  </w:endnote>
-  <w:endnote w:type="continuationSeparator" w:id="0">
-    <w:p>
-      <w:pPr>
-        <w:spacing w:after="0" w:line="240" w:lineRule="auto"/>
-      </w:pPr>
-      <w:r>
-        <w:continuationSeparator/>
-      </w:r>
-    </w:p>
-  </w:endnote>
-</w:endnotes>
-</file>
-
-<file path=word/footer1.xml><?xml version="1.0" encoding="utf-8"?>
-<w:ftr xmlns:wpc="http://schemas.microsoft.com/office/word/2010/wordprocessingCanvas" xmlns:cx="http://schemas.microsoft.com/office/drawing/2014/chartex" xmlns:cx1="http://schemas.microsoft.com/office/drawing/2015/9/8/chartex" xmlns:cx2="http://schemas.microsoft.com/office/drawing/2015/10/21/chartex" xmlns:cx3="http://schemas.microsoft.com/office/drawing/2016/5/9/chartex" xmlns:cx4="http://schemas.microsoft.com/office/drawing/2016/5/10/chartex" xmlns:cx5="http://schemas.microsoft.com/office/drawing/2016/5/11/chartex" xmlns:cx6="http://schemas.microsoft.com/office/drawing/2016/5/12/chartex" xmlns:cx7="http://schemas.microsoft.com/office/drawing/2016/5/13/chartex" xmlns:cx8="http://schemas.microsoft.com/office/drawing/2016/5/14/chartex" xmlns:mc="http://schemas.openxmlformats.org/markup-compatibility/2006" xmlns:aink="http://schemas.microsoft.com/office/drawing/2016/ink" xmlns:am3d="http://schemas.microsoft.com/office/drawing/2017/model3d" xmlns:o="urn:schemas-microsoft-com:office:office" xmlns:oel="http://schemas.microsoft.com/office/2019/extlst" xmlns:r="http://schemas.openxmlformats.org/officeDocument/2006/relationships" xmlns:m="http://schemas.openxmlformats.org/officeDocument/2006/math" xmlns:v="urn:schemas-microsoft-com:vml" xmlns:wp14="http://schemas.microsoft.com/office/word/2010/wordprocessingDrawing" xmlns:wp="http://schemas.openxmlformats.org/drawingml/2006/wordprocessingDrawing" xmlns:w10="urn:schemas-microsoft-com:office:word" xmlns:w="http://schemas.openxmlformats.org/wordprocessingml/2006/main" xmlns:w14="http://schemas.microsoft.com/office/word/2010/wordml" xmlns:w15="http://schemas.microsoft.com/office/word/2012/wordml" xmlns:w16cex="http://schemas.microsoft.com/office/word/2018/wordml/cex" xmlns:w16cid="http://schemas.microsoft.com/office/word/2016/wordml/cid" xmlns:w16="http://schemas.microsoft.com/office/word/2018/wordml" xmlns:w16du="http://schemas.microsoft.com/office/word/2023/wordml/word16du" xmlns:w16sdtdh="http://schemas.microsoft.com/office/word/2020/wordml/sdtdatahash" xmlns:w16sdtfl="http://schemas.microsoft.com/office/word/2024/wordml/sdtformatlock" xmlns:w16se="http://schemas.microsoft.com/office/word/2015/wordml/symex" xmlns:wpg="http://schemas.microsoft.com/office/word/2010/wordprocessingGroup" xmlns:wpi="http://schemas.microsoft.com/office/word/2010/wordprocessingInk" xmlns:wne="http://schemas.microsoft.com/office/word/2006/wordml" xmlns:wps="http://schemas.microsoft.com/office/word/2010/wordprocessingShape" mc:Ignorable="w14 w15 w16se w16cid w16 w16cex w16sdtdh w16sdtfl w16du wp14">
-  <w:p>
-    <w:pPr>
-      <w:pStyle w:val="Rodap"/>
-      <w:jc w:val="center"/>
-    </w:pPr>
-    <w:proofErr w:type="spellStart"/>
-    <w:r>
-      <w:t>Conecta</w:t>
-    </w:r>
-    <w:proofErr w:type="spellEnd"/>
-    <w:r>
-      <w:t xml:space="preserve"> Campus - </w:t>
-    </w:r>
-    <w:proofErr w:type="spellStart"/>
-    <w:r>
-      <w:t>Documentação</w:t>
-    </w:r>
-    <w:proofErr w:type="spellEnd"/>
-    <w:r>
-      <w:t xml:space="preserve"> Técnica - 2026</w:t>
-    </w:r>
-  </w:p>
-</w:ftr>
-</file>
-
-<file path=word/footnotes.xml><?xml version="1.0" encoding="utf-8"?>
-<w:footnotes xmlns:wpc="http://schemas.microsoft.com/office/word/2010/wordprocessingCanvas" xmlns:cx="http://schemas.microsoft.com/office/drawing/2014/chartex" xmlns:cx1="http://schemas.microsoft.com/office/drawing/2015/9/8/chartex" xmlns:cx2="http://schemas.microsoft.com/office/drawing/2015/10/21/chartex" xmlns:cx3="http://schemas.microsoft.com/office/drawing/2016/5/9/chartex" xmlns:cx4="http://schemas.microsoft.com/office/drawing/2016/5/10/chartex" xmlns:cx5="http://schemas.microsoft.com/office/drawing/2016/5/11/chartex" xmlns:cx6="http://schemas.microsoft.com/office/drawing/2016/5/12/chartex" xmlns:cx7="http://schemas.microsoft.com/office/drawing/2016/5/13/chartex" xmlns:cx8="http://schemas.microsoft.com/office/drawing/2016/5/14/chartex" xmlns:mc="http://schemas.openxmlformats.org/markup-compatibility/2006" xmlns:aink="http://schemas.microsoft.com/office/drawing/2016/ink" xmlns:am3d="http://schemas.microsoft.com/office/drawing/2017/model3d" xmlns:o="urn:schemas-microsoft-com:office:office" xmlns:oel="http://schemas.microsoft.com/office/2019/extlst" xmlns:r="http://schemas.openxmlformats.org/officeDocument/2006/relationships" xmlns:m="http://schemas.openxmlformats.org/officeDocument/2006/math" xmlns:v="urn:schemas-microsoft-com:vml" xmlns:wp14="http://schemas.microsoft.com/office/word/2010/wordprocessingDrawing" xmlns:wp="http://schemas.openxmlformats.org/drawingml/2006/wordprocessingDrawing" xmlns:w10="urn:schemas-microsoft-com:office:word" xmlns:w="http://schemas.openxmlformats.org/wordprocessingml/2006/main" xmlns:w14="http://schemas.microsoft.com/office/word/2010/wordml" xmlns:w15="http://schemas.microsoft.com/office/word/2012/wordml" xmlns:w16cex="http://schemas.microsoft.com/office/word/2018/wordml/cex" xmlns:w16cid="http://schemas.microsoft.com/office/word/2016/wordml/cid" xmlns:w16="http://schemas.microsoft.com/office/word/2018/wordml" xmlns:w16du="http://schemas.microsoft.com/office/word/2023/wordml/word16du" xmlns:w16sdtdh="http://schemas.microsoft.com/office/word/2020/wordml/sdtdatahash" xmlns:w16sdtfl="http://schemas.microsoft.com/office/word/2024/wordml/sdtformatlock" xmlns:w16se="http://schemas.microsoft.com/office/word/2015/wordml/symex" xmlns:wpg="http://schemas.microsoft.com/office/word/2010/wordprocessingGroup" xmlns:wpi="http://schemas.microsoft.com/office/word/2010/wordprocessingInk" xmlns:wne="http://schemas.microsoft.com/office/word/2006/wordml" xmlns:wps="http://schemas.microsoft.com/office/word/2010/wordprocessingShape" mc:Ignorable="w14 w15 w16se w16cid w16 w16cex w16sdtdh w16sdtfl w16du wp14">
-  <w:footnote w:type="separator" w:id="-1">
-    <w:p>
-      <w:pPr>
-        <w:spacing w:after="0" w:line="240" w:lineRule="auto"/>
-      </w:pPr>
-      <w:r>
-        <w:separator/>
-      </w:r>
-    </w:p>
-  </w:footnote>
-  <w:footnote w:type="continuationSeparator" w:id="0">
-    <w:p>
-      <w:pPr>
-        <w:spacing w:after="0" w:line="240" w:lineRule="auto"/>
-      </w:pPr>
-      <w:r>
-        <w:continuationSeparator/>
-      </w:r>
-    </w:p>
-  </w:footnote>
-</w:footnotes>
 </file>
 
 <file path=word/numbering.xml><?xml version="1.0" encoding="utf-8"?>
@@ -4405,31 +2263,31 @@
       </w:rPr>
     </w:lvl>
   </w:abstractNum>
-  <w:num w:numId="1" w16cid:durableId="1663005673">
+  <w:num w:numId="1" w16cid:durableId="1226645434">
     <w:abstractNumId w:val="8"/>
   </w:num>
-  <w:num w:numId="2" w16cid:durableId="1459959359">
+  <w:num w:numId="2" w16cid:durableId="434524964">
     <w:abstractNumId w:val="6"/>
   </w:num>
-  <w:num w:numId="3" w16cid:durableId="1548948862">
+  <w:num w:numId="3" w16cid:durableId="1761175889">
     <w:abstractNumId w:val="5"/>
   </w:num>
-  <w:num w:numId="4" w16cid:durableId="143859551">
+  <w:num w:numId="4" w16cid:durableId="773399175">
     <w:abstractNumId w:val="4"/>
   </w:num>
-  <w:num w:numId="5" w16cid:durableId="464472743">
+  <w:num w:numId="5" w16cid:durableId="1183012516">
     <w:abstractNumId w:val="7"/>
   </w:num>
-  <w:num w:numId="6" w16cid:durableId="510069028">
+  <w:num w:numId="6" w16cid:durableId="5985012">
     <w:abstractNumId w:val="3"/>
   </w:num>
-  <w:num w:numId="7" w16cid:durableId="75788480">
+  <w:num w:numId="7" w16cid:durableId="1273900629">
     <w:abstractNumId w:val="2"/>
   </w:num>
-  <w:num w:numId="8" w16cid:durableId="721296529">
+  <w:num w:numId="8" w16cid:durableId="206066967">
     <w:abstractNumId w:val="1"/>
   </w:num>
-  <w:num w:numId="9" w16cid:durableId="1191916437">
+  <w:num w:numId="9" w16cid:durableId="82192998">
     <w:abstractNumId w:val="0"/>
   </w:num>
 </w:numbering>
@@ -4826,7 +2684,7 @@
     <w:qFormat/>
     <w:rsid w:val="00FC693F"/>
     <w:rPr>
-      <w:rFonts w:ascii="Arial" w:hAnsi="Arial"/>
+      <w:rFonts w:ascii="Arial" w:eastAsia="Arial" w:hAnsi="Arial"/>
       <w:sz w:val="21"/>
     </w:rPr>
   </w:style>
@@ -4848,7 +2706,7 @@
       <w:rFonts w:asciiTheme="majorHAnsi" w:eastAsiaTheme="majorEastAsia" w:hAnsiTheme="majorHAnsi" w:cstheme="majorBidi"/>
       <w:b/>
       <w:bCs/>
-      <w:color w:val="06152E"/>
+      <w:color w:val="081F3B"/>
       <w:sz w:val="32"/>
       <w:szCs w:val="28"/>
     </w:rPr>
@@ -4872,7 +2730,7 @@
       <w:rFonts w:asciiTheme="majorHAnsi" w:eastAsiaTheme="majorEastAsia" w:hAnsiTheme="majorHAnsi" w:cstheme="majorBidi"/>
       <w:b/>
       <w:bCs/>
-      <w:color w:val="06152E"/>
+      <w:color w:val="0C3764"/>
       <w:sz w:val="26"/>
       <w:szCs w:val="26"/>
     </w:rPr>
@@ -4896,8 +2754,7 @@
       <w:rFonts w:asciiTheme="majorHAnsi" w:eastAsiaTheme="majorEastAsia" w:hAnsiTheme="majorHAnsi" w:cstheme="majorBidi"/>
       <w:b/>
       <w:bCs/>
-      <w:color w:val="06152E"/>
-      <w:sz w:val="23"/>
+      <w:color w:val="4F81BD" w:themeColor="accent1"/>
     </w:rPr>
   </w:style>
   <w:style w:type="paragraph" w:styleId="Ttulo4">

</xml_diff>